<commit_message>
Agrega tabla de contenido, numeración de páginas y referencias a los 9 documentos vigentes
Co-Authored-By: Claude Sonnet 5.5 <noreply@anthropic.com>
Claude-Session: https://claude.ai/code/session_01A5yFqx2DQWq2C9ytx8Wgdf
</commit_message>
<xml_diff>
--- a/Fase 2/Evidencias del Proyecto/SICMA_ACT_v1.0.docx
+++ b/Fase 2/Evidencias del Proyecto/SICMA_ACT_v1.0.docx
@@ -374,10 +374,274 @@
         <w:t>2026-10-17</w:t>
       </w:r>
     </w:p>
+    <w:p>
+      <w:pPr>
+        <w:spacing w:before="360" w:after="160"/>
+      </w:pPr>
+      <w:r>
+        <w:rPr>
+          <w:b/>
+          <w:color w:val="002840"/>
+          <w:sz w:val="32"/>
+        </w:rPr>
+        <w:t>Tabla de contenido</w:t>
+      </w:r>
+    </w:p>
+    <w:p>
+      <w:pPr>
+        <w:pStyle w:val="toc1"/>
+      </w:pPr>
+      <w:r>
+        <w:fldChar w:fldCharType="begin"/>
+      </w:r>
+      <w:r>
+        <w:instrText xml:space="preserve"> TOC \o "2-3" \h \z \u </w:instrText>
+      </w:r>
+      <w:r>
+        <w:fldChar w:fldCharType="separate"/>
+      </w:r>
+      <w:r>
+        <w:t>Control de cambios</w:t>
+      </w:r>
+      <w:r>
+        <w:tab/>
+      </w:r>
+      <w:r>
+        <w:t>3</w:t>
+      </w:r>
+    </w:p>
+    <w:p>
+      <w:pPr>
+        <w:pStyle w:val="toc1"/>
+      </w:pPr>
+      <w:r>
+        <w:t>Resumen y propósito</w:t>
+      </w:r>
+      <w:r>
+        <w:tab/>
+      </w:r>
+      <w:r>
+        <w:t>3</w:t>
+      </w:r>
+    </w:p>
+    <w:p>
+      <w:pPr>
+        <w:pStyle w:val="toc1"/>
+      </w:pPr>
+      <w:r>
+        <w:t>Convenciones</w:t>
+      </w:r>
+      <w:r>
+        <w:tab/>
+      </w:r>
+      <w:r>
+        <w:t>4</w:t>
+      </w:r>
+    </w:p>
+    <w:p>
+      <w:pPr>
+        <w:pStyle w:val="toc1"/>
+      </w:pPr>
+      <w:r>
+        <w:t>Diagramas de actividad</w:t>
+      </w:r>
+      <w:r>
+        <w:tab/>
+      </w:r>
+      <w:r>
+        <w:t>4</w:t>
+      </w:r>
+    </w:p>
+    <w:p>
+      <w:pPr>
+        <w:pStyle w:val="toc2"/>
+      </w:pPr>
+      <w:r>
+        <w:t>AD-01 · Iniciar sesión (CU-01)</w:t>
+      </w:r>
+      <w:r>
+        <w:tab/>
+      </w:r>
+      <w:r>
+        <w:t>5</w:t>
+      </w:r>
+    </w:p>
+    <w:p>
+      <w:pPr>
+        <w:pStyle w:val="toc2"/>
+      </w:pPr>
+      <w:r>
+        <w:t>AD-02 · Recuperar contraseña (CU-02)</w:t>
+      </w:r>
+      <w:r>
+        <w:tab/>
+      </w:r>
+      <w:r>
+        <w:t>6</w:t>
+      </w:r>
+    </w:p>
+    <w:p>
+      <w:pPr>
+        <w:pStyle w:val="toc2"/>
+      </w:pPr>
+      <w:r>
+        <w:t>AD-03 · Gestionar un activo y su historial (CU-04)</w:t>
+      </w:r>
+      <w:r>
+        <w:tab/>
+      </w:r>
+      <w:r>
+        <w:t>7</w:t>
+      </w:r>
+    </w:p>
+    <w:p>
+      <w:pPr>
+        <w:pStyle w:val="toc2"/>
+      </w:pPr>
+      <w:r>
+        <w:t>AD-04 · Recibir una lectura y generar la alerta (CU-10 y CU-12)</w:t>
+      </w:r>
+      <w:r>
+        <w:tab/>
+      </w:r>
+      <w:r>
+        <w:t>8</w:t>
+      </w:r>
+    </w:p>
+    <w:p>
+      <w:pPr>
+        <w:pStyle w:val="toc2"/>
+      </w:pPr>
+      <w:r>
+        <w:t>AD-05 · Sincronizar servidores desde Zabbix (CU-14)</w:t>
+      </w:r>
+      <w:r>
+        <w:tab/>
+      </w:r>
+      <w:r>
+        <w:t>9</w:t>
+      </w:r>
+    </w:p>
+    <w:p>
+      <w:pPr>
+        <w:pStyle w:val="toc2"/>
+      </w:pPr>
+      <w:r>
+        <w:t>AD-06 · Asociar la huella de un usuario (CU-16)</w:t>
+      </w:r>
+      <w:r>
+        <w:tab/>
+      </w:r>
+      <w:r>
+        <w:t>10</w:t>
+      </w:r>
+    </w:p>
+    <w:p>
+      <w:pPr>
+        <w:pStyle w:val="toc2"/>
+      </w:pPr>
+      <w:r>
+        <w:t>AD-07 · Registrar un intento de acceso (CU-17)</w:t>
+      </w:r>
+      <w:r>
+        <w:tab/>
+      </w:r>
+      <w:r>
+        <w:t>11</w:t>
+      </w:r>
+    </w:p>
+    <w:p>
+      <w:pPr>
+        <w:pStyle w:val="toc2"/>
+      </w:pPr>
+      <w:r>
+        <w:t>AD-08 · Solicitar y aprobar una intervención (CU-19 y CU-20)</w:t>
+      </w:r>
+      <w:r>
+        <w:tab/>
+      </w:r>
+      <w:r>
+        <w:t>12</w:t>
+      </w:r>
+    </w:p>
+    <w:p>
+      <w:pPr>
+        <w:pStyle w:val="toc2"/>
+      </w:pPr>
+      <w:r>
+        <w:t>AD-09 · Asignar, ejecutar y cerrar una intervención (CU-21, CU-22 y CU-23)</w:t>
+      </w:r>
+      <w:r>
+        <w:tab/>
+      </w:r>
+      <w:r>
+        <w:t>13</w:t>
+      </w:r>
+    </w:p>
+    <w:p>
+      <w:pPr>
+        <w:pStyle w:val="toc1"/>
+      </w:pPr>
+      <w:r>
+        <w:t>Trazabilidad</w:t>
+      </w:r>
+      <w:r>
+        <w:tab/>
+      </w:r>
+      <w:r>
+        <w:t>13</w:t>
+      </w:r>
+    </w:p>
+    <w:p>
+      <w:pPr>
+        <w:pStyle w:val="toc1"/>
+      </w:pPr>
+      <w:r>
+        <w:t>Supuestos y pendientes</w:t>
+      </w:r>
+      <w:r>
+        <w:tab/>
+      </w:r>
+      <w:r>
+        <w:t>14</w:t>
+      </w:r>
+    </w:p>
+    <w:p>
+      <w:pPr>
+        <w:pStyle w:val="toc1"/>
+      </w:pPr>
+      <w:r>
+        <w:t>Glosario y referencias</w:t>
+      </w:r>
+      <w:r>
+        <w:tab/>
+      </w:r>
+      <w:r>
+        <w:t>15</w:t>
+      </w:r>
+    </w:p>
+    <w:p>
+      <w:pPr>
+        <w:pStyle w:val="toc2"/>
+      </w:pPr>
+      <w:r>
+        <w:t>Referencias</w:t>
+      </w:r>
+      <w:r>
+        <w:tab/>
+      </w:r>
+      <w:r>
+        <w:t>15</w:t>
+      </w:r>
+      <w:r>
+        <w:fldChar w:fldCharType="end"/>
+      </w:r>
+    </w:p>
     <w:bookmarkStart w:id="20" w:name="control-de-cambios"/>
     <w:p>
       <w:pPr>
         <w:pStyle w:val="Heading2"/>
+        <w:pageBreakBefore/>
       </w:pPr>
       <w:r>
         <w:t xml:space="preserve">Control de cambios</w:t>
@@ -954,7 +1218,7 @@
               <w:rPr>
                 <w:sz w:val="18"/>
               </w:rPr>
-              <w:t>Pasa de borrador a vigente. Se agrega la portada y se actualizan las referencias a las versiones vigentes de los demás documentos.</w:t>
+              <w:t>Pasa de borrador a vigente. Se agrega la portada y se actualizan las referencias a las versiones vigentes de los demás documentos. Se agrega la tabla de contenido, la numeración de páginas y se completa la lista de referencias.</w:t>
             </w:r>
           </w:p>
         </w:tc>
@@ -4385,80 +4649,105 @@
     </w:tbl>
     <w:p>
       <w:pPr>
+        <w:pStyle w:val="Heading3"/>
+      </w:pPr>
+      <w:r>
+        <w:t>Referencias</w:t>
+      </w:r>
+    </w:p>
+    <w:p>
+      <w:pPr>
         <w:pStyle w:val="BodyText"/>
       </w:pPr>
       <w:r>
         <w:rPr>
-          <w:bCs/>
           <w:b/>
         </w:rPr>
-        <w:t xml:space="preserve">Referencias</w:t>
-      </w:r>
-    </w:p>
-    <w:p>
-      <w:pPr>
-        <w:numPr>
-          <w:ilvl w:val="0"/>
-          <w:numId w:val="1002"/>
-        </w:numPr>
+        <w:t>Documentos del proyecto</w:t>
+      </w:r>
+    </w:p>
+    <w:p>
+      <w:pPr>
         <w:pStyle w:val="Compact"/>
-      </w:pPr>
-      <w:r>
-        <w:t xml:space="preserve">OMG. Unified Modeling Language (UML), diagramas de actividad (ISO/IEC 19501).</w:t>
-      </w:r>
-    </w:p>
-    <w:p>
-      <w:pPr>
-        <w:numPr>
-          <w:ilvl w:val="0"/>
-          <w:numId w:val="1002"/>
-        </w:numPr>
+        <w:spacing w:after="60"/>
+        <w:ind w:left="510" w:hanging="510"/>
+      </w:pPr>
+      <w:r>
+        <w:rPr>
+          <w:b w:val="0"/>
+        </w:rPr>
+        <w:t>[1] Equipo SICMA. Formato Universal de documentos SICMA. 2026.</w:t>
+      </w:r>
+    </w:p>
+    <w:p>
+      <w:pPr>
         <w:pStyle w:val="Compact"/>
-      </w:pPr>
-      <w:r>
-        <w:t>SICMA Requerimientos (SICMA-REQ v1.0).</w:t>
-      </w:r>
-    </w:p>
-    <w:p>
-      <w:pPr>
-        <w:numPr>
-          <w:ilvl w:val="0"/>
-          <w:numId w:val="1002"/>
-        </w:numPr>
+        <w:spacing w:after="60"/>
+        <w:ind w:left="510" w:hanging="510"/>
+      </w:pPr>
+      <w:r>
+        <w:rPr>
+          <w:b w:val="0"/>
+        </w:rPr>
+        <w:t>[2] SICMA-REQ v1.0. Requerimientos. Equipo SICMA, 2026-10-17.</w:t>
+      </w:r>
+    </w:p>
+    <w:p>
+      <w:pPr>
         <w:pStyle w:val="Compact"/>
-      </w:pPr>
-      <w:r>
-        <w:t>SICMA Casos de Uso (SICMA-CUS v1.0).</w:t>
-      </w:r>
-    </w:p>
-    <w:p>
-      <w:pPr>
-        <w:numPr>
-          <w:ilvl w:val="0"/>
-          <w:numId w:val="1002"/>
-        </w:numPr>
+        <w:spacing w:after="60"/>
+        <w:ind w:left="510" w:hanging="510"/>
+      </w:pPr>
+      <w:r>
+        <w:rPr>
+          <w:b w:val="0"/>
+        </w:rPr>
+        <w:t>[3] SICMA-CUS v1.0. Casos de Uso. Equipo SICMA, 2026-10-17.</w:t>
+      </w:r>
+    </w:p>
+    <w:p>
+      <w:pPr>
         <w:pStyle w:val="Compact"/>
-      </w:pPr>
-      <w:r>
-        <w:t>SICMA Diagrama de Clases (SICMA-CLA v1.0).</w:t>
-      </w:r>
-    </w:p>
-    <w:p>
-      <w:pPr>
-        <w:numPr>
-          <w:ilvl w:val="0"/>
-          <w:numId w:val="1002"/>
-        </w:numPr>
+        <w:spacing w:after="60"/>
+        <w:ind w:left="510" w:hanging="510"/>
+      </w:pPr>
+      <w:r>
+        <w:rPr>
+          <w:b w:val="0"/>
+        </w:rPr>
+        <w:t>[4] SICMA-CLA v1.0. Diagrama de Clases. Equipo SICMA, 2026-10-17.</w:t>
+      </w:r>
+    </w:p>
+    <w:p>
+      <w:pPr>
+        <w:pStyle w:val="BodyText"/>
+      </w:pPr>
+      <w:r>
+        <w:rPr>
+          <w:b/>
+        </w:rPr>
+        <w:t>Normas y fuentes externas</w:t>
+      </w:r>
+    </w:p>
+    <w:p>
+      <w:pPr>
         <w:pStyle w:val="Compact"/>
-      </w:pPr>
-      <w:r>
-        <w:t xml:space="preserve">SICMA Formato Universal.</w:t>
+        <w:spacing w:after="60"/>
+        <w:ind w:left="510" w:hanging="510"/>
+      </w:pPr>
+      <w:r>
+        <w:rPr>
+          <w:b w:val="0"/>
+        </w:rPr>
+        <w:t>[5] OMG. (2017). Unified Modeling Language (UML) Specification, versión 2.5.1. Object Management Group.</w:t>
       </w:r>
     </w:p>
     <w:bookmarkEnd w:id="62"/>
     <w:sectPr>
+      <w:footerReference w:type="default" r:id="rId10"/>
       <w:pgSz w:w="12240" w:h="15840"/>
       <w:pgMar w:left="1247" w:right="1247" w:top="1247" w:bottom="1247"/>
+      <w:titlePg/>
     </w:sectPr>
   </w:body>
 </w:document>
@@ -4466,6 +4755,101 @@
 
 <file path=word/comments.xml><?xml version="1.0" encoding="utf-8"?>
 <w:comments xmlns:w="http://schemas.openxmlformats.org/wordprocessingml/2006/main" xmlns:m="http://schemas.openxmlformats.org/officeDocument/2006/math" xmlns:r="http://schemas.openxmlformats.org/officeDocument/2006/relationships" xmlns:o="urn:schemas-microsoft-com:office:office" xmlns:v="urn:schemas-microsoft-com:vml" xmlns:w10="urn:schemas-microsoft-com:office:word" xmlns:a="http://schemas.openxmlformats.org/drawingml/2006/main" xmlns:pic="http://schemas.openxmlformats.org/drawingml/2006/picture" xmlns:wp="http://schemas.openxmlformats.org/drawingml/2006/wordprocessingDrawing"/>
+</file>
+
+<file path=word/footer1.xml><?xml version="1.0" encoding="utf-8"?>
+<w:ftr xmlns:m="http://schemas.openxmlformats.org/officeDocument/2006/math" xmlns:mc="http://schemas.openxmlformats.org/markup-compatibility/2006" xmlns:mo="http://schemas.microsoft.com/office/mac/office/2008/main" xmlns:mv="urn:schemas-microsoft-com:mac:vml" xmlns:o="urn:schemas-microsoft-com:office:office" xmlns:r="http://schemas.openxmlformats.org/officeDocument/2006/relationships" xmlns:v="urn:schemas-microsoft-com:vml" xmlns:w10="urn:schemas-microsoft-com:office:word" xmlns:w14="http://schemas.microsoft.com/office/word/2010/wordml" xmlns:w="http://schemas.openxmlformats.org/wordprocessingml/2006/main" xmlns:wne="http://schemas.microsoft.com/office/word/2006/wordml" xmlns:wp14="http://schemas.microsoft.com/office/word/2010/wordprocessingDrawing" xmlns:wp="http://schemas.openxmlformats.org/drawingml/2006/wordprocessingDrawing" xmlns:wpc="http://schemas.microsoft.com/office/word/2010/wordprocessingCanvas" xmlns:wpg="http://schemas.microsoft.com/office/word/2010/wordprocessingGroup" xmlns:wpi="http://schemas.microsoft.com/office/word/2010/wordprocessingInk" xmlns:wps="http://schemas.microsoft.com/office/word/2010/wordprocessingShape" mc:Ignorable="w14 wp14">
+  <w:p>
+    <w:pPr>
+      <w:pStyle w:val="Footer"/>
+      <w:jc w:val="right"/>
+    </w:pPr>
+    <w:r>
+      <w:rPr>
+        <w:color w:val="595959"/>
+        <w:sz w:val="17"/>
+      </w:rPr>
+      <w:t xml:space="preserve">SICMA-ACT · Versión 1.0 · Página </w:t>
+    </w:r>
+    <w:r>
+      <w:rPr>
+        <w:color w:val="595959"/>
+        <w:sz w:val="17"/>
+      </w:rPr>
+      <w:fldChar w:fldCharType="begin"/>
+    </w:r>
+    <w:r>
+      <w:rPr>
+        <w:color w:val="595959"/>
+        <w:sz w:val="17"/>
+      </w:rPr>
+      <w:instrText xml:space="preserve"> PAGE </w:instrText>
+    </w:r>
+    <w:r>
+      <w:rPr>
+        <w:color w:val="595959"/>
+        <w:sz w:val="17"/>
+      </w:rPr>
+      <w:fldChar w:fldCharType="separate"/>
+    </w:r>
+    <w:r>
+      <w:rPr>
+        <w:color w:val="595959"/>
+        <w:sz w:val="17"/>
+      </w:rPr>
+      <w:t>1</w:t>
+    </w:r>
+    <w:r>
+      <w:rPr>
+        <w:color w:val="595959"/>
+        <w:sz w:val="17"/>
+      </w:rPr>
+      <w:fldChar w:fldCharType="end"/>
+    </w:r>
+    <w:r>
+      <w:rPr>
+        <w:color w:val="595959"/>
+        <w:sz w:val="17"/>
+      </w:rPr>
+      <w:t xml:space="preserve"> de </w:t>
+    </w:r>
+    <w:r>
+      <w:rPr>
+        <w:color w:val="595959"/>
+        <w:sz w:val="17"/>
+      </w:rPr>
+      <w:fldChar w:fldCharType="begin"/>
+    </w:r>
+    <w:r>
+      <w:rPr>
+        <w:color w:val="595959"/>
+        <w:sz w:val="17"/>
+      </w:rPr>
+      <w:instrText xml:space="preserve"> NUMPAGES </w:instrText>
+    </w:r>
+    <w:r>
+      <w:rPr>
+        <w:color w:val="595959"/>
+        <w:sz w:val="17"/>
+      </w:rPr>
+      <w:fldChar w:fldCharType="separate"/>
+    </w:r>
+    <w:r>
+      <w:rPr>
+        <w:color w:val="595959"/>
+        <w:sz w:val="17"/>
+      </w:rPr>
+      <w:t>1</w:t>
+    </w:r>
+    <w:r>
+      <w:rPr>
+        <w:color w:val="595959"/>
+        <w:sz w:val="17"/>
+      </w:rPr>
+      <w:fldChar w:fldCharType="end"/>
+    </w:r>
+  </w:p>
+</w:ftr>
 </file>
 
 <file path=word/footnotes.xml><?xml version="1.0" encoding="utf-8"?>
@@ -5425,6 +5809,66 @@
     <w:name w:val="NormalTok"/>
     <w:basedOn w:val="VerbatimChar"/>
     <w:rPr/>
+  </w:style>
+  <w:style w:type="paragraph" w:customStyle="1" w:styleId="toc1">
+    <w:name w:val="toc 1"/>
+    <w:basedOn w:val="Normal"/>
+    <w:pPr>
+      <w:tabs>
+        <w:tab w:pos="9746" w:val="right" w:leader="dot"/>
+      </w:tabs>
+      <w:spacing w:after="60" w:before="80"/>
+      <w:ind w:left="0"/>
+    </w:pPr>
+    <w:rPr>
+      <w:b/>
+      <w:sz w:val="20"/>
+    </w:rPr>
+  </w:style>
+  <w:style w:type="paragraph" w:customStyle="1" w:styleId="toc2">
+    <w:name w:val="toc 2"/>
+    <w:basedOn w:val="Normal"/>
+    <w:pPr>
+      <w:tabs>
+        <w:tab w:pos="9746" w:val="right" w:leader="dot"/>
+      </w:tabs>
+      <w:spacing w:after="40" w:before="0"/>
+      <w:ind w:left="283"/>
+    </w:pPr>
+    <w:rPr>
+      <w:b w:val="0"/>
+      <w:sz w:val="20"/>
+    </w:rPr>
+  </w:style>
+  <w:style w:type="paragraph" w:customStyle="1" w:styleId="toc3">
+    <w:name w:val="toc 3"/>
+    <w:basedOn w:val="Normal"/>
+    <w:pPr>
+      <w:tabs>
+        <w:tab w:pos="9746" w:val="right" w:leader="dot"/>
+      </w:tabs>
+      <w:spacing w:after="40" w:before="0"/>
+      <w:ind w:left="567"/>
+    </w:pPr>
+    <w:rPr>
+      <w:b w:val="0"/>
+      <w:sz w:val="20"/>
+    </w:rPr>
+  </w:style>
+  <w:style w:type="paragraph" w:customStyle="1" w:styleId="toc4">
+    <w:name w:val="toc 4"/>
+    <w:basedOn w:val="Normal"/>
+    <w:pPr>
+      <w:tabs>
+        <w:tab w:pos="9746" w:val="right" w:leader="dot"/>
+      </w:tabs>
+      <w:spacing w:after="40" w:before="0"/>
+      <w:ind w:left="850"/>
+    </w:pPr>
+    <w:rPr>
+      <w:b w:val="0"/>
+      <w:sz w:val="20"/>
+    </w:rPr>
   </w:style>
 </w:styles>
 </file>

</xml_diff>

<commit_message>
Quita la etiqueta Vigente de la portada de todos los documentos
Co-Authored-By: Claude Sonnet 5.5 <noreply@anthropic.com>
Claude-Session: https://claude.ai/code/session_01A5yFqx2DQWq2C9ytx8Wgdf
</commit_message>
<xml_diff>
--- a/Fase 2/Evidencias del Proyecto/SICMA_ACT_v1.0.docx
+++ b/Fase 2/Evidencias del Proyecto/SICMA_ACT_v1.0.docx
@@ -102,22 +102,6 @@
         </w:rPr>
         <w:t>SICMA-ACT</w:t>
       </w:r>
-      <w:r>
-        <w:rPr>
-          <w:color w:val="5A6672"/>
-          <w:sz w:val="26"/>
-        </w:rPr>
-        <w:t xml:space="preserve">  ·  </w:t>
-      </w:r>
-      <w:r>
-        <w:rPr>
-          <w:b/>
-          <w:color w:val="FFFFFF"/>
-          <w:sz w:val="21"/>
-          <w:shd w:val="clear" w:color="auto" w:fill="002840"/>
-        </w:rPr>
-        <w:t xml:space="preserve"> VIGENTE </w:t>
-      </w:r>
     </w:p>
     <w:p>
       <w:pPr>
@@ -1218,7 +1202,7 @@
               <w:rPr>
                 <w:sz w:val="18"/>
               </w:rPr>
-              <w:t>Pasa de borrador a vigente. Se agrega la portada y se actualizan las referencias a las versiones vigentes de los demás documentos. Se agrega la tabla de contenido, la numeración de páginas y se completa la lista de referencias.</w:t>
+              <w:t>Pasa de borrador a vigente. Se agrega la portada y se actualizan las referencias a las versiones vigentes de los demás documentos. Se agrega la tabla de contenido, la numeración de páginas y se completa la lista de referencias. Se quita la etiqueta Vigente de la portada.</w:t>
             </w:r>
           </w:p>
         </w:tc>

</xml_diff>

<commit_message>
Aplica el formato de entrega a los 11 documentos (márgenes 3 cm, interlineado 1,5, sangría, justificado, Calibri 11) y regenera índice y paginación
Co-Authored-By: Claude Sonnet 5.5 <noreply@anthropic.com>
Claude-Session: https://claude.ai/code/session_01A5yFqx2DQWq2C9ytx8Wgdf
</commit_message>
<xml_diff>
--- a/Fase 2/Evidencias del Proyecto/SICMA_ACT_v1.0.docx
+++ b/Fase 2/Evidencias del Proyecto/SICMA_ACT_v1.0.docx
@@ -118,13 +118,13 @@
         <w:tblInd w:w="108" w:type="dxa"/>
       </w:tblPr>
       <w:tblGrid>
-        <w:gridCol w:w="4873"/>
-        <w:gridCol w:w="4873"/>
+        <w:gridCol w:w="4365"/>
+        <w:gridCol w:w="4365"/>
       </w:tblGrid>
       <w:tr>
         <w:tc>
           <w:tcPr>
-            <w:tcW w:type="dxa" w:w="4762"/>
+            <w:tcW w:type="dxa" w:w="4265"/>
             <w:tcMar>
               <w:top w:w="160" w:type="dxa"/>
               <w:left w:w="0" w:type="dxa"/>
@@ -204,7 +204,7 @@
         </w:tc>
         <w:tc>
           <w:tcPr>
-            <w:tcW w:type="dxa" w:w="4762"/>
+            <w:tcW w:type="dxa" w:w="4265"/>
             <w:tcMar>
               <w:top w:w="160" w:type="dxa"/>
               <w:left w:w="0" w:type="dxa"/>
@@ -573,7 +573,7 @@
         <w:tab/>
       </w:r>
       <w:r>
-        <w:t>13</w:t>
+        <w:t>14</w:t>
       </w:r>
     </w:p>
     <w:p>
@@ -587,7 +587,7 @@
         <w:tab/>
       </w:r>
       <w:r>
-        <w:t>14</w:t>
+        <w:t>15</w:t>
       </w:r>
     </w:p>
     <w:p>
@@ -634,8 +634,14 @@
     <w:p>
       <w:pPr>
         <w:pStyle w:val="FirstParagraph"/>
-      </w:pPr>
-      <w:r>
+        <w:spacing w:line="360" w:lineRule="auto" w:before="160" w:after="0"/>
+        <w:ind w:firstLine="709"/>
+        <w:jc w:val="both"/>
+      </w:pPr>
+      <w:r>
+        <w:rPr>
+          <w:sz w:val="22"/>
+        </w:rPr>
         <w:t>Versión vigente 1.0 del documento SICMA-ACT. Reemplaza al borrador anterior; el detalle de cada versión está en la tabla de versiones.</w:t>
       </w:r>
     </w:p>
@@ -877,10 +883,10 @@
         </w:tblBorders>
       </w:tblPr>
       <w:tblGrid>
-        <w:gridCol w:w="1980"/>
-        <w:gridCol w:w="1980"/>
-        <w:gridCol w:w="1980"/>
-        <w:gridCol w:w="1980"/>
+        <w:gridCol w:w="972"/>
+        <w:gridCol w:w="1237"/>
+        <w:gridCol w:w="1502"/>
+        <w:gridCol w:w="5126"/>
       </w:tblGrid>
       <w:tr>
         <w:trPr>
@@ -888,6 +894,7 @@
         </w:trPr>
         <w:tc>
           <w:tcPr>
+            <w:tcW w:w="972" w:type="dxa"/>
             <w:shd w:val="clear" w:color="auto" w:fill="D9E2F3"/>
           </w:tcPr>
           <w:p>
@@ -906,6 +913,7 @@
         </w:tc>
         <w:tc>
           <w:tcPr>
+            <w:tcW w:w="1237" w:type="dxa"/>
             <w:shd w:val="clear" w:color="auto" w:fill="D9E2F3"/>
           </w:tcPr>
           <w:p>
@@ -924,6 +932,7 @@
         </w:tc>
         <w:tc>
           <w:tcPr>
+            <w:tcW w:w="1502" w:type="dxa"/>
             <w:shd w:val="clear" w:color="auto" w:fill="D9E2F3"/>
           </w:tcPr>
           <w:p>
@@ -942,6 +951,7 @@
         </w:tc>
         <w:tc>
           <w:tcPr>
+            <w:tcW w:w="5126" w:type="dxa"/>
             <w:shd w:val="clear" w:color="auto" w:fill="D9E2F3"/>
           </w:tcPr>
           <w:p>
@@ -961,7 +971,9 @@
       </w:tr>
       <w:tr>
         <w:tc>
-          <w:tcPr/>
+          <w:tcPr>
+            <w:tcW w:w="972" w:type="dxa"/>
+          </w:tcPr>
           <w:p>
             <w:pPr>
               <w:pStyle w:val="Compact"/>
@@ -976,7 +988,9 @@
           </w:p>
         </w:tc>
         <w:tc>
-          <w:tcPr/>
+          <w:tcPr>
+            <w:tcW w:w="1237" w:type="dxa"/>
+          </w:tcPr>
           <w:p>
             <w:pPr>
               <w:pStyle w:val="Compact"/>
@@ -991,7 +1005,9 @@
           </w:p>
         </w:tc>
         <w:tc>
-          <w:tcPr/>
+          <w:tcPr>
+            <w:tcW w:w="1502" w:type="dxa"/>
+          </w:tcPr>
           <w:p>
             <w:pPr>
               <w:pStyle w:val="Compact"/>
@@ -1006,7 +1022,9 @@
           </w:p>
         </w:tc>
         <w:tc>
-          <w:tcPr/>
+          <w:tcPr>
+            <w:tcW w:w="5126" w:type="dxa"/>
+          </w:tcPr>
           <w:p>
             <w:pPr>
               <w:pStyle w:val="Compact"/>
@@ -1023,7 +1041,9 @@
       </w:tr>
       <w:tr>
         <w:tc>
-          <w:tcPr/>
+          <w:tcPr>
+            <w:tcW w:w="972" w:type="dxa"/>
+          </w:tcPr>
           <w:p>
             <w:pPr>
               <w:pStyle w:val="Compact"/>
@@ -1038,7 +1058,9 @@
           </w:p>
         </w:tc>
         <w:tc>
-          <w:tcPr/>
+          <w:tcPr>
+            <w:tcW w:w="1237" w:type="dxa"/>
+          </w:tcPr>
           <w:p>
             <w:pPr>
               <w:pStyle w:val="Compact"/>
@@ -1053,7 +1075,9 @@
           </w:p>
         </w:tc>
         <w:tc>
-          <w:tcPr/>
+          <w:tcPr>
+            <w:tcW w:w="1502" w:type="dxa"/>
+          </w:tcPr>
           <w:p>
             <w:pPr>
               <w:pStyle w:val="Compact"/>
@@ -1068,7 +1092,9 @@
           </w:p>
         </w:tc>
         <w:tc>
-          <w:tcPr/>
+          <w:tcPr>
+            <w:tcW w:w="5126" w:type="dxa"/>
+          </w:tcPr>
           <w:p>
             <w:pPr>
               <w:pStyle w:val="Compact"/>
@@ -1085,7 +1111,9 @@
       </w:tr>
       <w:tr>
         <w:tc>
-          <w:tcPr/>
+          <w:tcPr>
+            <w:tcW w:w="972" w:type="dxa"/>
+          </w:tcPr>
           <w:p>
             <w:pPr>
               <w:pStyle w:val="Compact"/>
@@ -1100,7 +1128,9 @@
           </w:p>
         </w:tc>
         <w:tc>
-          <w:tcPr/>
+          <w:tcPr>
+            <w:tcW w:w="1237" w:type="dxa"/>
+          </w:tcPr>
           <w:p>
             <w:pPr>
               <w:pStyle w:val="Compact"/>
@@ -1115,7 +1145,9 @@
           </w:p>
         </w:tc>
         <w:tc>
-          <w:tcPr/>
+          <w:tcPr>
+            <w:tcW w:w="1502" w:type="dxa"/>
+          </w:tcPr>
           <w:p>
             <w:pPr>
               <w:pStyle w:val="Compact"/>
@@ -1130,7 +1162,9 @@
           </w:p>
         </w:tc>
         <w:tc>
-          <w:tcPr/>
+          <w:tcPr>
+            <w:tcW w:w="5126" w:type="dxa"/>
+          </w:tcPr>
           <w:p>
             <w:pPr>
               <w:pStyle w:val="Compact"/>
@@ -1147,7 +1181,9 @@
       </w:tr>
       <w:tr>
         <w:tc>
-          <w:tcPr/>
+          <w:tcPr>
+            <w:tcW w:w="972" w:type="dxa"/>
+          </w:tcPr>
           <w:p>
             <w:pPr>
               <w:pStyle w:val="Compact"/>
@@ -1162,7 +1198,9 @@
           </w:p>
         </w:tc>
         <w:tc>
-          <w:tcPr/>
+          <w:tcPr>
+            <w:tcW w:w="1237" w:type="dxa"/>
+          </w:tcPr>
           <w:p>
             <w:pPr>
               <w:pStyle w:val="Compact"/>
@@ -1177,7 +1215,9 @@
           </w:p>
         </w:tc>
         <w:tc>
-          <w:tcPr/>
+          <w:tcPr>
+            <w:tcW w:w="1502" w:type="dxa"/>
+          </w:tcPr>
           <w:p>
             <w:pPr>
               <w:pStyle w:val="Compact"/>
@@ -1192,17 +1232,19 @@
           </w:p>
         </w:tc>
         <w:tc>
-          <w:tcPr/>
-          <w:p>
-            <w:pPr>
-              <w:pStyle w:val="Compact"/>
-              <w:jc w:val="left"/>
-            </w:pPr>
-            <w:r>
-              <w:rPr>
-                <w:sz w:val="18"/>
-              </w:rPr>
-              <w:t>Pasa de borrador a vigente. Se agrega la portada y se actualizan las referencias a las versiones vigentes de los demás documentos. Se agrega la tabla de contenido, la numeración de páginas y se completa la lista de referencias. Se quita la etiqueta Vigente de la portada.</w:t>
+          <w:tcPr>
+            <w:tcW w:w="5126" w:type="dxa"/>
+          </w:tcPr>
+          <w:p>
+            <w:pPr>
+              <w:pStyle w:val="Compact"/>
+              <w:jc w:val="left"/>
+            </w:pPr>
+            <w:r>
+              <w:rPr>
+                <w:sz w:val="18"/>
+              </w:rPr>
+              <w:t>Pasa de borrador a vigente. Se agrega la portada y se actualizan las referencias a las versiones vigentes de los demás documentos. Se agrega la tabla de contenido, la numeración de páginas y se completa la lista de referencias. Se quita la etiqueta Vigente de la portada. Se aplica el formato de entrega (márgenes de 3 cm, interlineado 1,5, sangría y texto justificado).</w:t>
             </w:r>
           </w:p>
         </w:tc>
@@ -1221,16 +1263,28 @@
     <w:p>
       <w:pPr>
         <w:pStyle w:val="FirstParagraph"/>
-      </w:pPr>
-      <w:r>
+        <w:spacing w:line="360" w:lineRule="auto" w:before="160" w:after="0"/>
+        <w:ind w:firstLine="709"/>
+        <w:jc w:val="both"/>
+      </w:pPr>
+      <w:r>
+        <w:rPr>
+          <w:sz w:val="22"/>
+        </w:rPr>
         <w:t xml:space="preserve">Este documento tiene 9 diagramas de actividad que muestran, paso a paso, cómo funcionan los flujos más importantes de SICMA. Cubren 13 de los 25 casos de uso de SICMA-CUS.</w:t>
       </w:r>
     </w:p>
     <w:p>
       <w:pPr>
         <w:pStyle w:val="BodyText"/>
-      </w:pPr>
-      <w:r>
+        <w:spacing w:line="360" w:lineRule="auto" w:before="160" w:after="0"/>
+        <w:ind w:firstLine="709"/>
+        <w:jc w:val="both"/>
+      </w:pPr>
+      <w:r>
+        <w:rPr>
+          <w:sz w:val="22"/>
+        </w:rPr>
         <w:t xml:space="preserve">Un diagrama de actividad muestra el orden de los pasos, quién hace cada uno y qué pasa cuando algo falla. Se hicieron solo para los flujos con decisiones, varios actores o sistemas externos. Los casos de uso que solo crean, editan o consultan datos sin ramas (CU-03, CU-05 a CU-09, CU-11, CU-13, CU-15, CU-18, CU-24 y CU-25) ya quedan completos en sus fichas de SICMA-CUS.</w:t>
       </w:r>
     </w:p>
@@ -1740,8 +1794,14 @@
     <w:p>
       <w:pPr>
         <w:pStyle w:val="BodyText"/>
-      </w:pPr>
-      <w:r>
+        <w:spacing w:line="360" w:lineRule="auto" w:before="160" w:after="0"/>
+        <w:ind w:firstLine="709"/>
+        <w:jc w:val="both"/>
+      </w:pPr>
+      <w:r>
+        <w:rPr>
+          <w:sz w:val="22"/>
+        </w:rPr>
         <w:t xml:space="preserve">Sirven de base para los mockups (SICMA-MCK), el backend y los casos de prueba (SICMA-CPR), porque cada rama del diagrama es un caso que se debe probar.</w:t>
       </w:r>
     </w:p>
@@ -1758,8 +1818,14 @@
     <w:p>
       <w:pPr>
         <w:pStyle w:val="FirstParagraph"/>
-      </w:pPr>
-      <w:r>
+        <w:spacing w:line="360" w:lineRule="auto" w:before="160" w:after="0"/>
+        <w:ind w:firstLine="709"/>
+        <w:jc w:val="both"/>
+      </w:pPr>
+      <w:r>
+        <w:rPr>
+          <w:sz w:val="22"/>
+        </w:rPr>
         <w:t xml:space="preserve">Los diagramas usan la notación de actividad de UML (OMG, ISO/IEC 19501) en una versión simple. Cada diagrama se divide en calles, una por actor o sistema, y cada paso está en la calle de quien lo hace.</w:t>
       </w:r>
     </w:p>
@@ -2019,8 +2085,14 @@
     <w:p>
       <w:pPr>
         <w:pStyle w:val="BodyText"/>
-      </w:pPr>
-      <w:r>
+        <w:spacing w:line="360" w:lineRule="auto" w:before="160" w:after="0"/>
+        <w:ind w:firstLine="709"/>
+        <w:jc w:val="both"/>
+      </w:pPr>
+      <w:r>
+        <w:rPr>
+          <w:sz w:val="22"/>
+        </w:rPr>
         <w:t xml:space="preserve">Reglas de lectura:</w:t>
       </w:r>
     </w:p>
@@ -2085,8 +2157,14 @@
     <w:p>
       <w:pPr>
         <w:pStyle w:val="FirstParagraph"/>
-      </w:pPr>
-      <w:r>
+        <w:spacing w:line="360" w:lineRule="auto" w:before="160" w:after="0"/>
+        <w:ind w:firstLine="709"/>
+        <w:jc w:val="both"/>
+      </w:pPr>
+      <w:r>
+        <w:rPr>
+          <w:sz w:val="22"/>
+        </w:rPr>
         <w:t xml:space="preserve">Cada diagrama indica el caso de uso que modela, quién participa en cada calle y las ramas de error de la ficha. Las reglas de integridad (RI-nn) son las de SICMA-CLA.</w:t>
       </w:r>
     </w:p>
@@ -2157,8 +2235,14 @@
     <w:p>
       <w:pPr>
         <w:pStyle w:val="BodyText"/>
-      </w:pPr>
-      <w:r>
+        <w:spacing w:line="360" w:lineRule="auto" w:before="160" w:after="0"/>
+        <w:ind w:firstLine="709"/>
+        <w:jc w:val="both"/>
+      </w:pPr>
+      <w:r>
+        <w:rPr>
+          <w:sz w:val="22"/>
+        </w:rPr>
         <w:t xml:space="preserve">El usuario ingresa correo y contraseña. Si los datos no son válidos o la cuenta está desactivada o bloqueada, SICMA suma un intento fallido y rechaza sin decir qué dato falló (RI-03, RNF-SEG-02). Si son válidos, entrega un token JWT con el rol y el usuario ve solo las funciones de su rol. Al cerrar sesión o quedar inactivo, el token deja de valer.</w:t>
       </w:r>
     </w:p>
@@ -2230,8 +2314,14 @@
     <w:p>
       <w:pPr>
         <w:pStyle w:val="BodyText"/>
-      </w:pPr>
-      <w:r>
+        <w:spacing w:line="360" w:lineRule="auto" w:before="160" w:after="0"/>
+        <w:ind w:firstLine="709"/>
+        <w:jc w:val="both"/>
+      </w:pPr>
+      <w:r>
+        <w:rPr>
+          <w:sz w:val="22"/>
+        </w:rPr>
         <w:t xml:space="preserve">SICMA envía por SMTP un enlace de un solo uso y con vencimiento. Un enlace vencido o ya usado se rechaza (RI-04). La contraseña nueva debe cumplir la política; si no la cumple, se pide otra y el enlace sigue vigente. Al guardarla, SICMA la almacena con hash y deja el enlace inutilizado (RI-02). Una contraseña vencida por antigüedad obliga a este cambio al ingresar.</w:t>
       </w:r>
     </w:p>
@@ -2303,8 +2393,14 @@
     <w:p>
       <w:pPr>
         <w:pStyle w:val="BodyText"/>
-      </w:pPr>
-      <w:r>
+        <w:spacing w:line="360" w:lineRule="auto" w:before="160" w:after="0"/>
+        <w:ind w:firstLine="709"/>
+        <w:jc w:val="both"/>
+      </w:pPr>
+      <w:r>
+        <w:rPr>
+          <w:sz w:val="22"/>
+        </w:rPr>
         <w:t xml:space="preserve">El Administrador o el Técnico registra o edita un activo con su ubicación y responsable. SICMA valida los campos obligatorios y que el código no se repita (RI-06); si falla, no guarda e indica qué corregir. Si valida, guarda el activo y anota el cambio en su historial en una sola operación (RI-07). Si la escritura falla, revierte ambos y avisa del error.</w:t>
       </w:r>
     </w:p>
@@ -2376,8 +2472,14 @@
     <w:p>
       <w:pPr>
         <w:pStyle w:val="BodyText"/>
-      </w:pPr>
-      <w:r>
+        <w:spacing w:line="360" w:lineRule="auto" w:before="160" w:after="0"/>
+        <w:ind w:firstLine="709"/>
+        <w:jc w:val="both"/>
+      </w:pPr>
+      <w:r>
+        <w:rPr>
+          <w:sz w:val="22"/>
+        </w:rPr>
         <w:t xml:space="preserve">El dispositivo envía temperatura y humedad. SICMA rechaza los mensajes incompletos o de dispositivos no registrados o inactivos, y registra el error (RI-08). Si la escritura falla, no confirma y el dispositivo reintenta. Una lectura guardada se compara con los umbrales de su zona (RI-09). Si los supera, SICMA crea la alerta, o actualiza la que ya está abierta para esa zona y condición, y envía el correo a los responsables (RI-10). Si el correo falla, la alerta queda creada igual y el fallo se registra.</w:t>
       </w:r>
     </w:p>
@@ -2449,8 +2551,14 @@
     <w:p>
       <w:pPr>
         <w:pStyle w:val="BodyText"/>
-      </w:pPr>
-      <w:r>
+        <w:spacing w:line="360" w:lineRule="auto" w:before="160" w:after="0"/>
+        <w:ind w:firstLine="709"/>
+        <w:jc w:val="both"/>
+      </w:pPr>
+      <w:r>
+        <w:rPr>
+          <w:sz w:val="22"/>
+        </w:rPr>
         <w:t xml:space="preserve">Cada 1 minuto SICMA consulta a Zabbix. Si no responde, conserva la última sincronización, registra el fallo y el resto del sistema sigue operando. Si responde, actualiza el estado de cada servidor y registra solo los eventos nuevos, sin duplicarlos (RI-12), y deja constancia de la sincronización exitosa.</w:t>
       </w:r>
     </w:p>
@@ -2522,8 +2630,14 @@
     <w:p>
       <w:pPr>
         <w:pStyle w:val="BodyText"/>
-      </w:pPr>
-      <w:r>
+        <w:spacing w:line="360" w:lineRule="auto" w:before="160" w:after="0"/>
+        <w:ind w:firstLine="709"/>
+        <w:jc w:val="both"/>
+      </w:pPr>
+      <w:r>
+        <w:rPr>
+          <w:sz w:val="22"/>
+        </w:rPr>
         <w:t xml:space="preserve">El departamento de contratistas pide enrolar o revocar una huella y el Administrador lo registra. Para asociar, SICMA verifica que el identificador no pertenezca a otra persona; si ya existe, rechaza. Si está libre, guarda la asociación con su vigencia y estado (RI-13). Para revocar, SICMA deshabilita la asociación vigente. SICMA nunca guarda imágenes ni plantillas de huella, solo el identificador que usa el lector.</w:t>
       </w:r>
     </w:p>
@@ -2595,8 +2709,14 @@
     <w:p>
       <w:pPr>
         <w:pStyle w:val="BodyText"/>
-      </w:pPr>
-      <w:r>
+        <w:spacing w:line="360" w:lineRule="auto" w:before="160" w:after="0"/>
+        <w:ind w:firstLine="709"/>
+        <w:jc w:val="both"/>
+      </w:pPr>
+      <w:r>
+        <w:rPr>
+          <w:sz w:val="22"/>
+        </w:rPr>
         <w:t xml:space="preserve">El lector compara la huella en su PC y el PC envía a SICMA el identificador, el lector y el resultado. Si el mensaje no es válido, SICMA lo rechaza y registra el error. Si el identificador no corresponde a un usuario vigente, guarda el intento como denegado, sin usuario. En los demás casos guarda el intento con usuario, fecha, resultado y lector (RI-14). El intento no se puede editar ni eliminar (RI-12).</w:t>
       </w:r>
     </w:p>
@@ -2668,8 +2788,14 @@
     <w:p>
       <w:pPr>
         <w:pStyle w:val="BodyText"/>
-      </w:pPr>
-      <w:r>
+        <w:spacing w:line="360" w:lineRule="auto" w:before="160" w:after="0"/>
+        <w:ind w:firstLine="709"/>
+        <w:jc w:val="both"/>
+      </w:pPr>
+      <w:r>
+        <w:rPr>
+          <w:sz w:val="22"/>
+        </w:rPr>
         <w:t xml:space="preserve">El Técnico llena el formulario de Microsoft Forms y Power Automate lo envía a SICMA, que valida los datos. Si faltan datos o el término es anterior al inicio, no se registra y se avisa. Una solicitud válida queda Pendiente (RI-15). La Jefatura la aprueba o la rechaza en Microsoft Teams, con motivo si la rechaza. Power Automate entrega la decisión y SICMA registra quién la tomó y cuándo (RI-16). Si la Jefatura no responde en Teams, la solicitud sigue Pendiente.</w:t>
       </w:r>
     </w:p>
@@ -2741,8 +2867,14 @@
     <w:p>
       <w:pPr>
         <w:pStyle w:val="BodyText"/>
-      </w:pPr>
-      <w:r>
+        <w:spacing w:line="360" w:lineRule="auto" w:before="160" w:after="0"/>
+        <w:ind w:firstLine="709"/>
+        <w:jc w:val="both"/>
+      </w:pPr>
+      <w:r>
+        <w:rPr>
+          <w:sz w:val="22"/>
+        </w:rPr>
         <w:t xml:space="preserve">El Administrador elige un técnico para una intervención Aprobada. Si el técnico ya tiene otra intervención en ese horario, SICMA avisa y el Administrador elige otro (RI-17). Con el técnico disponible, SICMA guarda la asignación y agenda en el calendario compartido; si el calendario falla, la asignación queda guardada y se reintenta el agendamiento. La intervención pasa a Asignada y SICMA avisa el cambio a los involucrados. Solo el Técnico asignado puede iniciarla y registrar lo realizado; sin resultado no se puede cerrar. Cada cambio de estado queda en el historial (RI-18).</w:t>
       </w:r>
     </w:p>
@@ -2760,8 +2892,14 @@
     <w:p>
       <w:pPr>
         <w:pStyle w:val="FirstParagraph"/>
-      </w:pPr>
-      <w:r>
+        <w:spacing w:line="360" w:lineRule="auto" w:before="160" w:after="0"/>
+        <w:ind w:firstLine="709"/>
+        <w:jc w:val="both"/>
+      </w:pPr>
+      <w:r>
+        <w:rPr>
+          <w:sz w:val="22"/>
+        </w:rPr>
         <w:t xml:space="preserve">Cada diagrama se apoya en un caso de uso de SICMA-CUS, usa clases de SICMA-CLA y hace cumplir sus reglas de integridad. La columna de casos de prueba se completa cuando exista SICMA-CPR.</w:t>
       </w:r>
     </w:p>
@@ -3579,8 +3717,14 @@
     <w:p>
       <w:pPr>
         <w:pStyle w:val="BodyText"/>
-      </w:pPr>
-      <w:r>
+        <w:spacing w:line="360" w:lineRule="auto" w:before="160" w:after="0"/>
+        <w:ind w:firstLine="709"/>
+        <w:jc w:val="both"/>
+      </w:pPr>
+      <w:r>
+        <w:rPr>
+          <w:sz w:val="22"/>
+        </w:rPr>
         <w:t xml:space="preserve">Los casos de uso sin diagrama propio se prueban directamente con los pasos de su ficha en SICMA-CUS.</w:t>
       </w:r>
     </w:p>
@@ -4331,8 +4475,14 @@
     <w:p>
       <w:pPr>
         <w:pStyle w:val="BodyText"/>
-      </w:pPr>
-      <w:r>
+        <w:spacing w:line="360" w:lineRule="auto" w:before="160" w:after="0"/>
+        <w:ind w:firstLine="709"/>
+        <w:jc w:val="both"/>
+      </w:pPr>
+      <w:r>
+        <w:rPr>
+          <w:sz w:val="22"/>
+        </w:rPr>
         <w:t xml:space="preserve">Estados de una intervención usados aquí: Pendiente, Aprobada, Rechazada, Asignada, En ejecución y Cerrada. Son los mismos de SICMA-CUS y SICMA-CLA.</w:t>
       </w:r>
     </w:p>
@@ -4642,10 +4792,15 @@
     <w:p>
       <w:pPr>
         <w:pStyle w:val="BodyText"/>
+        <w:keepNext/>
+        <w:spacing w:line="360" w:lineRule="auto" w:before="160" w:after="0"/>
+        <w:ind w:firstLine="709"/>
+        <w:jc w:val="both"/>
       </w:pPr>
       <w:r>
         <w:rPr>
           <w:b/>
+          <w:sz w:val="22"/>
         </w:rPr>
         <w:t>Documentos del proyecto</w:t>
       </w:r>
@@ -4705,10 +4860,15 @@
     <w:p>
       <w:pPr>
         <w:pStyle w:val="BodyText"/>
+        <w:keepNext/>
+        <w:spacing w:line="360" w:lineRule="auto" w:before="160" w:after="0"/>
+        <w:ind w:firstLine="709"/>
+        <w:jc w:val="both"/>
       </w:pPr>
       <w:r>
         <w:rPr>
           <w:b/>
+          <w:sz w:val="22"/>
         </w:rPr>
         <w:t>Normas y fuentes externas</w:t>
       </w:r>
@@ -4730,7 +4890,7 @@
     <w:sectPr>
       <w:footerReference w:type="default" r:id="rId10"/>
       <w:pgSz w:w="12240" w:h="15840"/>
-      <w:pgMar w:left="1247" w:right="1247" w:top="1247" w:bottom="1247"/>
+      <w:pgMar w:left="1701" w:right="1701" w:top="1701" w:bottom="1701" w:header="850" w:footer="964"/>
       <w:titlePg/>
     </w:sectPr>
   </w:body>
@@ -5799,7 +5959,7 @@
     <w:basedOn w:val="Normal"/>
     <w:pPr>
       <w:tabs>
-        <w:tab w:pos="9746" w:val="right" w:leader="dot"/>
+        <w:tab w:pos="8838" w:val="right" w:leader="dot"/>
       </w:tabs>
       <w:spacing w:after="60" w:before="80"/>
       <w:ind w:left="0"/>
@@ -5814,7 +5974,7 @@
     <w:basedOn w:val="Normal"/>
     <w:pPr>
       <w:tabs>
-        <w:tab w:pos="9746" w:val="right" w:leader="dot"/>
+        <w:tab w:pos="8838" w:val="right" w:leader="dot"/>
       </w:tabs>
       <w:spacing w:after="40" w:before="0"/>
       <w:ind w:left="283"/>
@@ -5829,7 +5989,7 @@
     <w:basedOn w:val="Normal"/>
     <w:pPr>
       <w:tabs>
-        <w:tab w:pos="9746" w:val="right" w:leader="dot"/>
+        <w:tab w:pos="8838" w:val="right" w:leader="dot"/>
       </w:tabs>
       <w:spacing w:after="40" w:before="0"/>
       <w:ind w:left="567"/>
@@ -5844,7 +6004,7 @@
     <w:basedOn w:val="Normal"/>
     <w:pPr>
       <w:tabs>
-        <w:tab w:pos="9746" w:val="right" w:leader="dot"/>
+        <w:tab w:pos="8838" w:val="right" w:leader="dot"/>
       </w:tabs>
       <w:spacing w:after="40" w:before="0"/>
       <w:ind w:left="850"/>

</xml_diff>

<commit_message>
Redacta en tercera persona las historias de usuario de SICMA-REQ, corrige una tilde en SICMA-MCK y ajusta el ancho de las columnas de las tablas
Co-Authored-By: Claude Sonnet 5.5 <noreply@anthropic.com>
Claude-Session: https://claude.ai/code/session_01A5yFqx2DQWq2C9ytx8Wgdf
</commit_message>
<xml_diff>
--- a/Fase 2/Evidencias del Proyecto/SICMA_ACT_v1.0.docx
+++ b/Fase 2/Evidencias del Proyecto/SICMA_ACT_v1.0.docx
@@ -587,7 +587,7 @@
         <w:tab/>
       </w:r>
       <w:r>
-        <w:t>15</w:t>
+        <w:t>14</w:t>
       </w:r>
     </w:p>
     <w:p>
@@ -661,8 +661,8 @@
         </w:tblBorders>
       </w:tblPr>
       <w:tblGrid>
-        <w:gridCol w:w="3960"/>
-        <w:gridCol w:w="3960"/>
+        <w:gridCol w:w="3586"/>
+        <w:gridCol w:w="4331"/>
       </w:tblGrid>
       <w:tr>
         <w:trPr>
@@ -670,6 +670,7 @@
         </w:trPr>
         <w:tc>
           <w:tcPr>
+            <w:tcW w:w="3586" w:type="dxa"/>
             <w:shd w:val="clear" w:color="auto" w:fill="D9E2F3"/>
           </w:tcPr>
           <w:p>
@@ -688,6 +689,7 @@
         </w:tc>
         <w:tc>
           <w:tcPr>
+            <w:tcW w:w="4331" w:type="dxa"/>
             <w:shd w:val="clear" w:color="auto" w:fill="D9E2F3"/>
           </w:tcPr>
           <w:p>
@@ -707,7 +709,9 @@
       </w:tr>
       <w:tr>
         <w:tc>
-          <w:tcPr/>
+          <w:tcPr>
+            <w:tcW w:w="3586" w:type="dxa"/>
+          </w:tcPr>
           <w:p>
             <w:pPr>
               <w:pStyle w:val="Compact"/>
@@ -722,7 +726,9 @@
           </w:p>
         </w:tc>
         <w:tc>
-          <w:tcPr/>
+          <w:tcPr>
+            <w:tcW w:w="4331" w:type="dxa"/>
+          </w:tcPr>
           <w:p>
             <w:pPr>
               <w:pStyle w:val="Compact"/>
@@ -739,7 +745,9 @@
       </w:tr>
       <w:tr>
         <w:tc>
-          <w:tcPr/>
+          <w:tcPr>
+            <w:tcW w:w="3586" w:type="dxa"/>
+          </w:tcPr>
           <w:p>
             <w:pPr>
               <w:pStyle w:val="Compact"/>
@@ -754,7 +762,9 @@
           </w:p>
         </w:tc>
         <w:tc>
-          <w:tcPr/>
+          <w:tcPr>
+            <w:tcW w:w="4331" w:type="dxa"/>
+          </w:tcPr>
           <w:p>
             <w:pPr>
               <w:pStyle w:val="Compact"/>
@@ -771,7 +781,9 @@
       </w:tr>
       <w:tr>
         <w:tc>
-          <w:tcPr/>
+          <w:tcPr>
+            <w:tcW w:w="3586" w:type="dxa"/>
+          </w:tcPr>
           <w:p>
             <w:pPr>
               <w:pStyle w:val="Compact"/>
@@ -786,7 +798,9 @@
           </w:p>
         </w:tc>
         <w:tc>
-          <w:tcPr/>
+          <w:tcPr>
+            <w:tcW w:w="4331" w:type="dxa"/>
+          </w:tcPr>
           <w:p>
             <w:pPr>
               <w:pStyle w:val="Compact"/>
@@ -803,7 +817,9 @@
       </w:tr>
       <w:tr>
         <w:tc>
-          <w:tcPr/>
+          <w:tcPr>
+            <w:tcW w:w="3586" w:type="dxa"/>
+          </w:tcPr>
           <w:p>
             <w:pPr>
               <w:pStyle w:val="Compact"/>
@@ -818,7 +834,9 @@
           </w:p>
         </w:tc>
         <w:tc>
-          <w:tcPr/>
+          <w:tcPr>
+            <w:tcW w:w="4331" w:type="dxa"/>
+          </w:tcPr>
           <w:p>
             <w:pPr>
               <w:pStyle w:val="Compact"/>
@@ -835,7 +853,9 @@
       </w:tr>
       <w:tr>
         <w:tc>
-          <w:tcPr/>
+          <w:tcPr>
+            <w:tcW w:w="3586" w:type="dxa"/>
+          </w:tcPr>
           <w:p>
             <w:pPr>
               <w:pStyle w:val="Compact"/>
@@ -850,7 +870,9 @@
           </w:p>
         </w:tc>
         <w:tc>
-          <w:tcPr/>
+          <w:tcPr>
+            <w:tcW w:w="4331" w:type="dxa"/>
+          </w:tcPr>
           <w:p>
             <w:pPr>
               <w:pStyle w:val="Compact"/>
@@ -1244,7 +1266,7 @@
               <w:rPr>
                 <w:sz w:val="18"/>
               </w:rPr>
-              <w:t>Pasa de borrador a vigente. Se agrega la portada y se actualizan las referencias a las versiones vigentes de los demás documentos. Se agrega la tabla de contenido, la numeración de páginas y se completa la lista de referencias. Se quita la etiqueta Vigente de la portada. Se aplica el formato de entrega (márgenes de 3 cm, interlineado 1,5, sangría y texto justificado).</w:t>
+              <w:t>Pasa de borrador a vigente. Se agrega la portada y se actualizan las referencias a las versiones vigentes de los demás documentos. Se agrega la tabla de contenido, la numeración de páginas y se completa la lista de referencias. Se quita la etiqueta Vigente de la portada. Se aplica el formato de entrega (márgenes de 3 cm, interlineado 1,5, sangría y texto justificado). Se ajusta el ancho de las columnas de las tablas.</w:t>
             </w:r>
           </w:p>
         </w:tc>
@@ -1304,9 +1326,9 @@
         </w:tblBorders>
       </w:tblPr>
       <w:tblGrid>
-        <w:gridCol w:w="2640"/>
-        <w:gridCol w:w="2640"/>
-        <w:gridCol w:w="2640"/>
+        <w:gridCol w:w="1922"/>
+        <w:gridCol w:w="3745"/>
+        <w:gridCol w:w="2248"/>
       </w:tblGrid>
       <w:tr>
         <w:trPr>
@@ -1314,6 +1336,7 @@
         </w:trPr>
         <w:tc>
           <w:tcPr>
+            <w:tcW w:w="1922" w:type="dxa"/>
             <w:shd w:val="clear" w:color="auto" w:fill="D9E2F3"/>
           </w:tcPr>
           <w:p>
@@ -1332,6 +1355,7 @@
         </w:tc>
         <w:tc>
           <w:tcPr>
+            <w:tcW w:w="3745" w:type="dxa"/>
             <w:shd w:val="clear" w:color="auto" w:fill="D9E2F3"/>
           </w:tcPr>
           <w:p>
@@ -1350,6 +1374,7 @@
         </w:tc>
         <w:tc>
           <w:tcPr>
+            <w:tcW w:w="2248" w:type="dxa"/>
             <w:shd w:val="clear" w:color="auto" w:fill="D9E2F3"/>
           </w:tcPr>
           <w:p>
@@ -1369,7 +1394,9 @@
       </w:tr>
       <w:tr>
         <w:tc>
-          <w:tcPr/>
+          <w:tcPr>
+            <w:tcW w:w="1922" w:type="dxa"/>
+          </w:tcPr>
           <w:p>
             <w:pPr>
               <w:pStyle w:val="Compact"/>
@@ -1384,7 +1411,9 @@
           </w:p>
         </w:tc>
         <w:tc>
-          <w:tcPr/>
+          <w:tcPr>
+            <w:tcW w:w="3745" w:type="dxa"/>
+          </w:tcPr>
           <w:p>
             <w:pPr>
               <w:pStyle w:val="Compact"/>
@@ -1399,7 +1428,9 @@
           </w:p>
         </w:tc>
         <w:tc>
-          <w:tcPr/>
+          <w:tcPr>
+            <w:tcW w:w="2248" w:type="dxa"/>
+          </w:tcPr>
           <w:p>
             <w:pPr>
               <w:pStyle w:val="Compact"/>
@@ -1416,7 +1447,9 @@
       </w:tr>
       <w:tr>
         <w:tc>
-          <w:tcPr/>
+          <w:tcPr>
+            <w:tcW w:w="1922" w:type="dxa"/>
+          </w:tcPr>
           <w:p>
             <w:pPr>
               <w:pStyle w:val="Compact"/>
@@ -1431,7 +1464,9 @@
           </w:p>
         </w:tc>
         <w:tc>
-          <w:tcPr/>
+          <w:tcPr>
+            <w:tcW w:w="3745" w:type="dxa"/>
+          </w:tcPr>
           <w:p>
             <w:pPr>
               <w:pStyle w:val="Compact"/>
@@ -1446,7 +1481,9 @@
           </w:p>
         </w:tc>
         <w:tc>
-          <w:tcPr/>
+          <w:tcPr>
+            <w:tcW w:w="2248" w:type="dxa"/>
+          </w:tcPr>
           <w:p>
             <w:pPr>
               <w:pStyle w:val="Compact"/>
@@ -1463,7 +1500,9 @@
       </w:tr>
       <w:tr>
         <w:tc>
-          <w:tcPr/>
+          <w:tcPr>
+            <w:tcW w:w="1922" w:type="dxa"/>
+          </w:tcPr>
           <w:p>
             <w:pPr>
               <w:pStyle w:val="Compact"/>
@@ -1478,7 +1517,9 @@
           </w:p>
         </w:tc>
         <w:tc>
-          <w:tcPr/>
+          <w:tcPr>
+            <w:tcW w:w="3745" w:type="dxa"/>
+          </w:tcPr>
           <w:p>
             <w:pPr>
               <w:pStyle w:val="Compact"/>
@@ -1493,7 +1534,9 @@
           </w:p>
         </w:tc>
         <w:tc>
-          <w:tcPr/>
+          <w:tcPr>
+            <w:tcW w:w="2248" w:type="dxa"/>
+          </w:tcPr>
           <w:p>
             <w:pPr>
               <w:pStyle w:val="Compact"/>
@@ -1510,7 +1553,9 @@
       </w:tr>
       <w:tr>
         <w:tc>
-          <w:tcPr/>
+          <w:tcPr>
+            <w:tcW w:w="1922" w:type="dxa"/>
+          </w:tcPr>
           <w:p>
             <w:pPr>
               <w:pStyle w:val="Compact"/>
@@ -1525,7 +1570,9 @@
           </w:p>
         </w:tc>
         <w:tc>
-          <w:tcPr/>
+          <w:tcPr>
+            <w:tcW w:w="3745" w:type="dxa"/>
+          </w:tcPr>
           <w:p>
             <w:pPr>
               <w:pStyle w:val="Compact"/>
@@ -1540,7 +1587,9 @@
           </w:p>
         </w:tc>
         <w:tc>
-          <w:tcPr/>
+          <w:tcPr>
+            <w:tcW w:w="2248" w:type="dxa"/>
+          </w:tcPr>
           <w:p>
             <w:pPr>
               <w:pStyle w:val="Compact"/>
@@ -1557,7 +1606,9 @@
       </w:tr>
       <w:tr>
         <w:tc>
-          <w:tcPr/>
+          <w:tcPr>
+            <w:tcW w:w="1922" w:type="dxa"/>
+          </w:tcPr>
           <w:p>
             <w:pPr>
               <w:pStyle w:val="Compact"/>
@@ -1572,7 +1623,9 @@
           </w:p>
         </w:tc>
         <w:tc>
-          <w:tcPr/>
+          <w:tcPr>
+            <w:tcW w:w="3745" w:type="dxa"/>
+          </w:tcPr>
           <w:p>
             <w:pPr>
               <w:pStyle w:val="Compact"/>
@@ -1587,7 +1640,9 @@
           </w:p>
         </w:tc>
         <w:tc>
-          <w:tcPr/>
+          <w:tcPr>
+            <w:tcW w:w="2248" w:type="dxa"/>
+          </w:tcPr>
           <w:p>
             <w:pPr>
               <w:pStyle w:val="Compact"/>
@@ -1604,7 +1659,9 @@
       </w:tr>
       <w:tr>
         <w:tc>
-          <w:tcPr/>
+          <w:tcPr>
+            <w:tcW w:w="1922" w:type="dxa"/>
+          </w:tcPr>
           <w:p>
             <w:pPr>
               <w:pStyle w:val="Compact"/>
@@ -1619,7 +1676,9 @@
           </w:p>
         </w:tc>
         <w:tc>
-          <w:tcPr/>
+          <w:tcPr>
+            <w:tcW w:w="3745" w:type="dxa"/>
+          </w:tcPr>
           <w:p>
             <w:pPr>
               <w:pStyle w:val="Compact"/>
@@ -1634,7 +1693,9 @@
           </w:p>
         </w:tc>
         <w:tc>
-          <w:tcPr/>
+          <w:tcPr>
+            <w:tcW w:w="2248" w:type="dxa"/>
+          </w:tcPr>
           <w:p>
             <w:pPr>
               <w:pStyle w:val="Compact"/>
@@ -1651,7 +1712,9 @@
       </w:tr>
       <w:tr>
         <w:tc>
-          <w:tcPr/>
+          <w:tcPr>
+            <w:tcW w:w="1922" w:type="dxa"/>
+          </w:tcPr>
           <w:p>
             <w:pPr>
               <w:pStyle w:val="Compact"/>
@@ -1666,7 +1729,9 @@
           </w:p>
         </w:tc>
         <w:tc>
-          <w:tcPr/>
+          <w:tcPr>
+            <w:tcW w:w="3745" w:type="dxa"/>
+          </w:tcPr>
           <w:p>
             <w:pPr>
               <w:pStyle w:val="Compact"/>
@@ -1681,7 +1746,9 @@
           </w:p>
         </w:tc>
         <w:tc>
-          <w:tcPr/>
+          <w:tcPr>
+            <w:tcW w:w="2248" w:type="dxa"/>
+          </w:tcPr>
           <w:p>
             <w:pPr>
               <w:pStyle w:val="Compact"/>
@@ -1698,7 +1765,9 @@
       </w:tr>
       <w:tr>
         <w:tc>
-          <w:tcPr/>
+          <w:tcPr>
+            <w:tcW w:w="1922" w:type="dxa"/>
+          </w:tcPr>
           <w:p>
             <w:pPr>
               <w:pStyle w:val="Compact"/>
@@ -1713,7 +1782,9 @@
           </w:p>
         </w:tc>
         <w:tc>
-          <w:tcPr/>
+          <w:tcPr>
+            <w:tcW w:w="3745" w:type="dxa"/>
+          </w:tcPr>
           <w:p>
             <w:pPr>
               <w:pStyle w:val="Compact"/>
@@ -1728,7 +1799,9 @@
           </w:p>
         </w:tc>
         <w:tc>
-          <w:tcPr/>
+          <w:tcPr>
+            <w:tcW w:w="2248" w:type="dxa"/>
+          </w:tcPr>
           <w:p>
             <w:pPr>
               <w:pStyle w:val="Compact"/>
@@ -1745,7 +1818,9 @@
       </w:tr>
       <w:tr>
         <w:tc>
-          <w:tcPr/>
+          <w:tcPr>
+            <w:tcW w:w="1922" w:type="dxa"/>
+          </w:tcPr>
           <w:p>
             <w:pPr>
               <w:pStyle w:val="Compact"/>
@@ -1760,7 +1835,9 @@
           </w:p>
         </w:tc>
         <w:tc>
-          <w:tcPr/>
+          <w:tcPr>
+            <w:tcW w:w="3745" w:type="dxa"/>
+          </w:tcPr>
           <w:p>
             <w:pPr>
               <w:pStyle w:val="Compact"/>
@@ -1775,7 +1852,9 @@
           </w:p>
         </w:tc>
         <w:tc>
-          <w:tcPr/>
+          <w:tcPr>
+            <w:tcW w:w="2248" w:type="dxa"/>
+          </w:tcPr>
           <w:p>
             <w:pPr>
               <w:pStyle w:val="Compact"/>
@@ -1845,8 +1924,8 @@
         </w:tblBorders>
       </w:tblPr>
       <w:tblGrid>
-        <w:gridCol w:w="3960"/>
-        <w:gridCol w:w="3960"/>
+        <w:gridCol w:w="3296"/>
+        <w:gridCol w:w="4621"/>
       </w:tblGrid>
       <w:tr>
         <w:trPr>
@@ -1854,6 +1933,7 @@
         </w:trPr>
         <w:tc>
           <w:tcPr>
+            <w:tcW w:w="3296" w:type="dxa"/>
             <w:shd w:val="clear" w:color="auto" w:fill="D9E2F3"/>
           </w:tcPr>
           <w:p>
@@ -1872,6 +1952,7 @@
         </w:tc>
         <w:tc>
           <w:tcPr>
+            <w:tcW w:w="4621" w:type="dxa"/>
             <w:shd w:val="clear" w:color="auto" w:fill="D9E2F3"/>
           </w:tcPr>
           <w:p>
@@ -1891,7 +1972,9 @@
       </w:tr>
       <w:tr>
         <w:tc>
-          <w:tcPr/>
+          <w:tcPr>
+            <w:tcW w:w="3296" w:type="dxa"/>
+          </w:tcPr>
           <w:p>
             <w:pPr>
               <w:pStyle w:val="Compact"/>
@@ -1906,7 +1989,9 @@
           </w:p>
         </w:tc>
         <w:tc>
-          <w:tcPr/>
+          <w:tcPr>
+            <w:tcW w:w="4621" w:type="dxa"/>
+          </w:tcPr>
           <w:p>
             <w:pPr>
               <w:pStyle w:val="Compact"/>
@@ -1923,7 +2008,9 @@
       </w:tr>
       <w:tr>
         <w:tc>
-          <w:tcPr/>
+          <w:tcPr>
+            <w:tcW w:w="3296" w:type="dxa"/>
+          </w:tcPr>
           <w:p>
             <w:pPr>
               <w:pStyle w:val="Compact"/>
@@ -1938,7 +2025,9 @@
           </w:p>
         </w:tc>
         <w:tc>
-          <w:tcPr/>
+          <w:tcPr>
+            <w:tcW w:w="4621" w:type="dxa"/>
+          </w:tcPr>
           <w:p>
             <w:pPr>
               <w:pStyle w:val="Compact"/>
@@ -1955,7 +2044,9 @@
       </w:tr>
       <w:tr>
         <w:tc>
-          <w:tcPr/>
+          <w:tcPr>
+            <w:tcW w:w="3296" w:type="dxa"/>
+          </w:tcPr>
           <w:p>
             <w:pPr>
               <w:pStyle w:val="Compact"/>
@@ -1970,7 +2061,9 @@
           </w:p>
         </w:tc>
         <w:tc>
-          <w:tcPr/>
+          <w:tcPr>
+            <w:tcW w:w="4621" w:type="dxa"/>
+          </w:tcPr>
           <w:p>
             <w:pPr>
               <w:pStyle w:val="Compact"/>
@@ -1987,7 +2080,9 @@
       </w:tr>
       <w:tr>
         <w:tc>
-          <w:tcPr/>
+          <w:tcPr>
+            <w:tcW w:w="3296" w:type="dxa"/>
+          </w:tcPr>
           <w:p>
             <w:pPr>
               <w:pStyle w:val="Compact"/>
@@ -2002,7 +2097,9 @@
           </w:p>
         </w:tc>
         <w:tc>
-          <w:tcPr/>
+          <w:tcPr>
+            <w:tcW w:w="4621" w:type="dxa"/>
+          </w:tcPr>
           <w:p>
             <w:pPr>
               <w:pStyle w:val="Compact"/>
@@ -2019,7 +2116,9 @@
       </w:tr>
       <w:tr>
         <w:tc>
-          <w:tcPr/>
+          <w:tcPr>
+            <w:tcW w:w="3296" w:type="dxa"/>
+          </w:tcPr>
           <w:p>
             <w:pPr>
               <w:pStyle w:val="Compact"/>
@@ -2034,7 +2133,9 @@
           </w:p>
         </w:tc>
         <w:tc>
-          <w:tcPr/>
+          <w:tcPr>
+            <w:tcW w:w="4621" w:type="dxa"/>
+          </w:tcPr>
           <w:p>
             <w:pPr>
               <w:pStyle w:val="Compact"/>
@@ -2051,7 +2152,9 @@
       </w:tr>
       <w:tr>
         <w:tc>
-          <w:tcPr/>
+          <w:tcPr>
+            <w:tcW w:w="3296" w:type="dxa"/>
+          </w:tcPr>
           <w:p>
             <w:pPr>
               <w:pStyle w:val="Compact"/>
@@ -2066,7 +2169,9 @@
           </w:p>
         </w:tc>
         <w:tc>
-          <w:tcPr/>
+          <w:tcPr>
+            <w:tcW w:w="4621" w:type="dxa"/>
+          </w:tcPr>
           <w:p>
             <w:pPr>
               <w:pStyle w:val="Compact"/>
@@ -2919,11 +3024,11 @@
         </w:tblBorders>
       </w:tblPr>
       <w:tblGrid>
-        <w:gridCol w:w="1584"/>
-        <w:gridCol w:w="1584"/>
-        <w:gridCol w:w="1584"/>
-        <w:gridCol w:w="1584"/>
-        <w:gridCol w:w="1584"/>
+        <w:gridCol w:w="1114"/>
+        <w:gridCol w:w="1286"/>
+        <w:gridCol w:w="2547"/>
+        <w:gridCol w:w="1617"/>
+        <w:gridCol w:w="1347"/>
       </w:tblGrid>
       <w:tr>
         <w:trPr>
@@ -2931,6 +3036,7 @@
         </w:trPr>
         <w:tc>
           <w:tcPr>
+            <w:tcW w:w="1114" w:type="dxa"/>
             <w:shd w:val="clear" w:color="auto" w:fill="D9E2F3"/>
           </w:tcPr>
           <w:p>
@@ -2949,6 +3055,7 @@
         </w:tc>
         <w:tc>
           <w:tcPr>
+            <w:tcW w:w="1286" w:type="dxa"/>
             <w:shd w:val="clear" w:color="auto" w:fill="D9E2F3"/>
           </w:tcPr>
           <w:p>
@@ -2967,6 +3074,7 @@
         </w:tc>
         <w:tc>
           <w:tcPr>
+            <w:tcW w:w="2547" w:type="dxa"/>
             <w:shd w:val="clear" w:color="auto" w:fill="D9E2F3"/>
           </w:tcPr>
           <w:p>
@@ -2985,6 +3093,7 @@
         </w:tc>
         <w:tc>
           <w:tcPr>
+            <w:tcW w:w="1617" w:type="dxa"/>
             <w:shd w:val="clear" w:color="auto" w:fill="D9E2F3"/>
           </w:tcPr>
           <w:p>
@@ -3003,6 +3112,7 @@
         </w:tc>
         <w:tc>
           <w:tcPr>
+            <w:tcW w:w="1347" w:type="dxa"/>
             <w:shd w:val="clear" w:color="auto" w:fill="D9E2F3"/>
           </w:tcPr>
           <w:p>
@@ -3022,7 +3132,9 @@
       </w:tr>
       <w:tr>
         <w:tc>
-          <w:tcPr/>
+          <w:tcPr>
+            <w:tcW w:w="1114" w:type="dxa"/>
+          </w:tcPr>
           <w:p>
             <w:pPr>
               <w:pStyle w:val="Compact"/>
@@ -3037,7 +3149,9 @@
           </w:p>
         </w:tc>
         <w:tc>
-          <w:tcPr/>
+          <w:tcPr>
+            <w:tcW w:w="1286" w:type="dxa"/>
+          </w:tcPr>
           <w:p>
             <w:pPr>
               <w:pStyle w:val="Compact"/>
@@ -3052,7 +3166,9 @@
           </w:p>
         </w:tc>
         <w:tc>
-          <w:tcPr/>
+          <w:tcPr>
+            <w:tcW w:w="2547" w:type="dxa"/>
+          </w:tcPr>
           <w:p>
             <w:pPr>
               <w:pStyle w:val="Compact"/>
@@ -3067,7 +3183,9 @@
           </w:p>
         </w:tc>
         <w:tc>
-          <w:tcPr/>
+          <w:tcPr>
+            <w:tcW w:w="1617" w:type="dxa"/>
+          </w:tcPr>
           <w:p>
             <w:pPr>
               <w:pStyle w:val="Compact"/>
@@ -3082,7 +3200,9 @@
           </w:p>
         </w:tc>
         <w:tc>
-          <w:tcPr/>
+          <w:tcPr>
+            <w:tcW w:w="1347" w:type="dxa"/>
+          </w:tcPr>
           <w:p>
             <w:pPr>
               <w:pStyle w:val="Compact"/>
@@ -3099,7 +3219,9 @@
       </w:tr>
       <w:tr>
         <w:tc>
-          <w:tcPr/>
+          <w:tcPr>
+            <w:tcW w:w="1114" w:type="dxa"/>
+          </w:tcPr>
           <w:p>
             <w:pPr>
               <w:pStyle w:val="Compact"/>
@@ -3114,7 +3236,9 @@
           </w:p>
         </w:tc>
         <w:tc>
-          <w:tcPr/>
+          <w:tcPr>
+            <w:tcW w:w="1286" w:type="dxa"/>
+          </w:tcPr>
           <w:p>
             <w:pPr>
               <w:pStyle w:val="Compact"/>
@@ -3129,7 +3253,9 @@
           </w:p>
         </w:tc>
         <w:tc>
-          <w:tcPr/>
+          <w:tcPr>
+            <w:tcW w:w="2547" w:type="dxa"/>
+          </w:tcPr>
           <w:p>
             <w:pPr>
               <w:pStyle w:val="Compact"/>
@@ -3144,7 +3270,9 @@
           </w:p>
         </w:tc>
         <w:tc>
-          <w:tcPr/>
+          <w:tcPr>
+            <w:tcW w:w="1617" w:type="dxa"/>
+          </w:tcPr>
           <w:p>
             <w:pPr>
               <w:pStyle w:val="Compact"/>
@@ -3159,7 +3287,9 @@
           </w:p>
         </w:tc>
         <w:tc>
-          <w:tcPr/>
+          <w:tcPr>
+            <w:tcW w:w="1347" w:type="dxa"/>
+          </w:tcPr>
           <w:p>
             <w:pPr>
               <w:pStyle w:val="Compact"/>
@@ -3176,7 +3306,9 @@
       </w:tr>
       <w:tr>
         <w:tc>
-          <w:tcPr/>
+          <w:tcPr>
+            <w:tcW w:w="1114" w:type="dxa"/>
+          </w:tcPr>
           <w:p>
             <w:pPr>
               <w:pStyle w:val="Compact"/>
@@ -3191,7 +3323,9 @@
           </w:p>
         </w:tc>
         <w:tc>
-          <w:tcPr/>
+          <w:tcPr>
+            <w:tcW w:w="1286" w:type="dxa"/>
+          </w:tcPr>
           <w:p>
             <w:pPr>
               <w:pStyle w:val="Compact"/>
@@ -3206,7 +3340,9 @@
           </w:p>
         </w:tc>
         <w:tc>
-          <w:tcPr/>
+          <w:tcPr>
+            <w:tcW w:w="2547" w:type="dxa"/>
+          </w:tcPr>
           <w:p>
             <w:pPr>
               <w:pStyle w:val="Compact"/>
@@ -3221,7 +3357,9 @@
           </w:p>
         </w:tc>
         <w:tc>
-          <w:tcPr/>
+          <w:tcPr>
+            <w:tcW w:w="1617" w:type="dxa"/>
+          </w:tcPr>
           <w:p>
             <w:pPr>
               <w:pStyle w:val="Compact"/>
@@ -3236,7 +3374,9 @@
           </w:p>
         </w:tc>
         <w:tc>
-          <w:tcPr/>
+          <w:tcPr>
+            <w:tcW w:w="1347" w:type="dxa"/>
+          </w:tcPr>
           <w:p>
             <w:pPr>
               <w:pStyle w:val="Compact"/>
@@ -3253,7 +3393,9 @@
       </w:tr>
       <w:tr>
         <w:tc>
-          <w:tcPr/>
+          <w:tcPr>
+            <w:tcW w:w="1114" w:type="dxa"/>
+          </w:tcPr>
           <w:p>
             <w:pPr>
               <w:pStyle w:val="Compact"/>
@@ -3268,7 +3410,9 @@
           </w:p>
         </w:tc>
         <w:tc>
-          <w:tcPr/>
+          <w:tcPr>
+            <w:tcW w:w="1286" w:type="dxa"/>
+          </w:tcPr>
           <w:p>
             <w:pPr>
               <w:pStyle w:val="Compact"/>
@@ -3283,7 +3427,9 @@
           </w:p>
         </w:tc>
         <w:tc>
-          <w:tcPr/>
+          <w:tcPr>
+            <w:tcW w:w="2547" w:type="dxa"/>
+          </w:tcPr>
           <w:p>
             <w:pPr>
               <w:pStyle w:val="Compact"/>
@@ -3298,7 +3444,9 @@
           </w:p>
         </w:tc>
         <w:tc>
-          <w:tcPr/>
+          <w:tcPr>
+            <w:tcW w:w="1617" w:type="dxa"/>
+          </w:tcPr>
           <w:p>
             <w:pPr>
               <w:pStyle w:val="Compact"/>
@@ -3313,7 +3461,9 @@
           </w:p>
         </w:tc>
         <w:tc>
-          <w:tcPr/>
+          <w:tcPr>
+            <w:tcW w:w="1347" w:type="dxa"/>
+          </w:tcPr>
           <w:p>
             <w:pPr>
               <w:pStyle w:val="Compact"/>
@@ -3330,7 +3480,9 @@
       </w:tr>
       <w:tr>
         <w:tc>
-          <w:tcPr/>
+          <w:tcPr>
+            <w:tcW w:w="1114" w:type="dxa"/>
+          </w:tcPr>
           <w:p>
             <w:pPr>
               <w:pStyle w:val="Compact"/>
@@ -3345,7 +3497,9 @@
           </w:p>
         </w:tc>
         <w:tc>
-          <w:tcPr/>
+          <w:tcPr>
+            <w:tcW w:w="1286" w:type="dxa"/>
+          </w:tcPr>
           <w:p>
             <w:pPr>
               <w:pStyle w:val="Compact"/>
@@ -3360,7 +3514,9 @@
           </w:p>
         </w:tc>
         <w:tc>
-          <w:tcPr/>
+          <w:tcPr>
+            <w:tcW w:w="2547" w:type="dxa"/>
+          </w:tcPr>
           <w:p>
             <w:pPr>
               <w:pStyle w:val="Compact"/>
@@ -3375,7 +3531,9 @@
           </w:p>
         </w:tc>
         <w:tc>
-          <w:tcPr/>
+          <w:tcPr>
+            <w:tcW w:w="1617" w:type="dxa"/>
+          </w:tcPr>
           <w:p>
             <w:pPr>
               <w:pStyle w:val="Compact"/>
@@ -3390,7 +3548,9 @@
           </w:p>
         </w:tc>
         <w:tc>
-          <w:tcPr/>
+          <w:tcPr>
+            <w:tcW w:w="1347" w:type="dxa"/>
+          </w:tcPr>
           <w:p>
             <w:pPr>
               <w:pStyle w:val="Compact"/>
@@ -3407,7 +3567,9 @@
       </w:tr>
       <w:tr>
         <w:tc>
-          <w:tcPr/>
+          <w:tcPr>
+            <w:tcW w:w="1114" w:type="dxa"/>
+          </w:tcPr>
           <w:p>
             <w:pPr>
               <w:pStyle w:val="Compact"/>
@@ -3422,7 +3584,9 @@
           </w:p>
         </w:tc>
         <w:tc>
-          <w:tcPr/>
+          <w:tcPr>
+            <w:tcW w:w="1286" w:type="dxa"/>
+          </w:tcPr>
           <w:p>
             <w:pPr>
               <w:pStyle w:val="Compact"/>
@@ -3437,7 +3601,9 @@
           </w:p>
         </w:tc>
         <w:tc>
-          <w:tcPr/>
+          <w:tcPr>
+            <w:tcW w:w="2547" w:type="dxa"/>
+          </w:tcPr>
           <w:p>
             <w:pPr>
               <w:pStyle w:val="Compact"/>
@@ -3452,7 +3618,9 @@
           </w:p>
         </w:tc>
         <w:tc>
-          <w:tcPr/>
+          <w:tcPr>
+            <w:tcW w:w="1617" w:type="dxa"/>
+          </w:tcPr>
           <w:p>
             <w:pPr>
               <w:pStyle w:val="Compact"/>
@@ -3467,7 +3635,9 @@
           </w:p>
         </w:tc>
         <w:tc>
-          <w:tcPr/>
+          <w:tcPr>
+            <w:tcW w:w="1347" w:type="dxa"/>
+          </w:tcPr>
           <w:p>
             <w:pPr>
               <w:pStyle w:val="Compact"/>
@@ -3484,7 +3654,9 @@
       </w:tr>
       <w:tr>
         <w:tc>
-          <w:tcPr/>
+          <w:tcPr>
+            <w:tcW w:w="1114" w:type="dxa"/>
+          </w:tcPr>
           <w:p>
             <w:pPr>
               <w:pStyle w:val="Compact"/>
@@ -3499,7 +3671,9 @@
           </w:p>
         </w:tc>
         <w:tc>
-          <w:tcPr/>
+          <w:tcPr>
+            <w:tcW w:w="1286" w:type="dxa"/>
+          </w:tcPr>
           <w:p>
             <w:pPr>
               <w:pStyle w:val="Compact"/>
@@ -3514,7 +3688,9 @@
           </w:p>
         </w:tc>
         <w:tc>
-          <w:tcPr/>
+          <w:tcPr>
+            <w:tcW w:w="2547" w:type="dxa"/>
+          </w:tcPr>
           <w:p>
             <w:pPr>
               <w:pStyle w:val="Compact"/>
@@ -3529,7 +3705,9 @@
           </w:p>
         </w:tc>
         <w:tc>
-          <w:tcPr/>
+          <w:tcPr>
+            <w:tcW w:w="1617" w:type="dxa"/>
+          </w:tcPr>
           <w:p>
             <w:pPr>
               <w:pStyle w:val="Compact"/>
@@ -3544,7 +3722,9 @@
           </w:p>
         </w:tc>
         <w:tc>
-          <w:tcPr/>
+          <w:tcPr>
+            <w:tcW w:w="1347" w:type="dxa"/>
+          </w:tcPr>
           <w:p>
             <w:pPr>
               <w:pStyle w:val="Compact"/>
@@ -3561,7 +3741,9 @@
       </w:tr>
       <w:tr>
         <w:tc>
-          <w:tcPr/>
+          <w:tcPr>
+            <w:tcW w:w="1114" w:type="dxa"/>
+          </w:tcPr>
           <w:p>
             <w:pPr>
               <w:pStyle w:val="Compact"/>
@@ -3576,7 +3758,9 @@
           </w:p>
         </w:tc>
         <w:tc>
-          <w:tcPr/>
+          <w:tcPr>
+            <w:tcW w:w="1286" w:type="dxa"/>
+          </w:tcPr>
           <w:p>
             <w:pPr>
               <w:pStyle w:val="Compact"/>
@@ -3591,7 +3775,9 @@
           </w:p>
         </w:tc>
         <w:tc>
-          <w:tcPr/>
+          <w:tcPr>
+            <w:tcW w:w="2547" w:type="dxa"/>
+          </w:tcPr>
           <w:p>
             <w:pPr>
               <w:pStyle w:val="Compact"/>
@@ -3606,7 +3792,9 @@
           </w:p>
         </w:tc>
         <w:tc>
-          <w:tcPr/>
+          <w:tcPr>
+            <w:tcW w:w="1617" w:type="dxa"/>
+          </w:tcPr>
           <w:p>
             <w:pPr>
               <w:pStyle w:val="Compact"/>
@@ -3621,7 +3809,9 @@
           </w:p>
         </w:tc>
         <w:tc>
-          <w:tcPr/>
+          <w:tcPr>
+            <w:tcW w:w="1347" w:type="dxa"/>
+          </w:tcPr>
           <w:p>
             <w:pPr>
               <w:pStyle w:val="Compact"/>
@@ -3638,7 +3828,9 @@
       </w:tr>
       <w:tr>
         <w:tc>
-          <w:tcPr/>
+          <w:tcPr>
+            <w:tcW w:w="1114" w:type="dxa"/>
+          </w:tcPr>
           <w:p>
             <w:pPr>
               <w:pStyle w:val="Compact"/>
@@ -3653,7 +3845,9 @@
           </w:p>
         </w:tc>
         <w:tc>
-          <w:tcPr/>
+          <w:tcPr>
+            <w:tcW w:w="1286" w:type="dxa"/>
+          </w:tcPr>
           <w:p>
             <w:pPr>
               <w:pStyle w:val="Compact"/>
@@ -3668,7 +3862,9 @@
           </w:p>
         </w:tc>
         <w:tc>
-          <w:tcPr/>
+          <w:tcPr>
+            <w:tcW w:w="2547" w:type="dxa"/>
+          </w:tcPr>
           <w:p>
             <w:pPr>
               <w:pStyle w:val="Compact"/>
@@ -3683,7 +3879,9 @@
           </w:p>
         </w:tc>
         <w:tc>
-          <w:tcPr/>
+          <w:tcPr>
+            <w:tcW w:w="1617" w:type="dxa"/>
+          </w:tcPr>
           <w:p>
             <w:pPr>
               <w:pStyle w:val="Compact"/>
@@ -3698,7 +3896,9 @@
           </w:p>
         </w:tc>
         <w:tc>
-          <w:tcPr/>
+          <w:tcPr>
+            <w:tcW w:w="1347" w:type="dxa"/>
+          </w:tcPr>
           <w:p>
             <w:pPr>
               <w:pStyle w:val="Compact"/>
@@ -3754,11 +3954,11 @@
         </w:tblBorders>
       </w:tblPr>
       <w:tblGrid>
-        <w:gridCol w:w="1584"/>
-        <w:gridCol w:w="1584"/>
-        <w:gridCol w:w="1584"/>
-        <w:gridCol w:w="1584"/>
-        <w:gridCol w:w="1584"/>
+        <w:gridCol w:w="936"/>
+        <w:gridCol w:w="2543"/>
+        <w:gridCol w:w="2256"/>
+        <w:gridCol w:w="1056"/>
+        <w:gridCol w:w="1119"/>
       </w:tblGrid>
       <w:tr>
         <w:trPr>
@@ -3766,6 +3966,7 @@
         </w:trPr>
         <w:tc>
           <w:tcPr>
+            <w:tcW w:w="936" w:type="dxa"/>
             <w:shd w:val="clear" w:color="auto" w:fill="D9E2F3"/>
           </w:tcPr>
           <w:p>
@@ -3784,6 +3985,7 @@
         </w:tc>
         <w:tc>
           <w:tcPr>
+            <w:tcW w:w="2543" w:type="dxa"/>
             <w:shd w:val="clear" w:color="auto" w:fill="D9E2F3"/>
           </w:tcPr>
           <w:p>
@@ -3802,6 +4004,7 @@
         </w:tc>
         <w:tc>
           <w:tcPr>
+            <w:tcW w:w="2256" w:type="dxa"/>
             <w:shd w:val="clear" w:color="auto" w:fill="D9E2F3"/>
           </w:tcPr>
           <w:p>
@@ -3820,6 +4023,7 @@
         </w:tc>
         <w:tc>
           <w:tcPr>
+            <w:tcW w:w="1056" w:type="dxa"/>
             <w:shd w:val="clear" w:color="auto" w:fill="D9E2F3"/>
           </w:tcPr>
           <w:p>
@@ -3838,6 +4042,7 @@
         </w:tc>
         <w:tc>
           <w:tcPr>
+            <w:tcW w:w="1119" w:type="dxa"/>
             <w:shd w:val="clear" w:color="auto" w:fill="D9E2F3"/>
           </w:tcPr>
           <w:p>
@@ -3857,7 +4062,9 @@
       </w:tr>
       <w:tr>
         <w:tc>
-          <w:tcPr/>
+          <w:tcPr>
+            <w:tcW w:w="936" w:type="dxa"/>
+          </w:tcPr>
           <w:p>
             <w:pPr>
               <w:pStyle w:val="Compact"/>
@@ -3872,7 +4079,9 @@
           </w:p>
         </w:tc>
         <w:tc>
-          <w:tcPr/>
+          <w:tcPr>
+            <w:tcW w:w="2543" w:type="dxa"/>
+          </w:tcPr>
           <w:p>
             <w:pPr>
               <w:pStyle w:val="Compact"/>
@@ -3887,7 +4096,9 @@
           </w:p>
         </w:tc>
         <w:tc>
-          <w:tcPr/>
+          <w:tcPr>
+            <w:tcW w:w="2256" w:type="dxa"/>
+          </w:tcPr>
           <w:p>
             <w:pPr>
               <w:pStyle w:val="Compact"/>
@@ -3902,7 +4113,9 @@
           </w:p>
         </w:tc>
         <w:tc>
-          <w:tcPr/>
+          <w:tcPr>
+            <w:tcW w:w="1056" w:type="dxa"/>
+          </w:tcPr>
           <w:p>
             <w:pPr>
               <w:pStyle w:val="Compact"/>
@@ -3917,7 +4130,9 @@
           </w:p>
         </w:tc>
         <w:tc>
-          <w:tcPr/>
+          <w:tcPr>
+            <w:tcW w:w="1119" w:type="dxa"/>
+          </w:tcPr>
           <w:p>
             <w:pPr>
               <w:pStyle w:val="Compact"/>
@@ -3934,7 +4149,9 @@
       </w:tr>
       <w:tr>
         <w:tc>
-          <w:tcPr/>
+          <w:tcPr>
+            <w:tcW w:w="936" w:type="dxa"/>
+          </w:tcPr>
           <w:p>
             <w:pPr>
               <w:pStyle w:val="Compact"/>
@@ -3949,7 +4166,9 @@
           </w:p>
         </w:tc>
         <w:tc>
-          <w:tcPr/>
+          <w:tcPr>
+            <w:tcW w:w="2543" w:type="dxa"/>
+          </w:tcPr>
           <w:p>
             <w:pPr>
               <w:pStyle w:val="Compact"/>
@@ -3964,7 +4183,9 @@
           </w:p>
         </w:tc>
         <w:tc>
-          <w:tcPr/>
+          <w:tcPr>
+            <w:tcW w:w="2256" w:type="dxa"/>
+          </w:tcPr>
           <w:p>
             <w:pPr>
               <w:pStyle w:val="Compact"/>
@@ -3979,7 +4200,9 @@
           </w:p>
         </w:tc>
         <w:tc>
-          <w:tcPr/>
+          <w:tcPr>
+            <w:tcW w:w="1056" w:type="dxa"/>
+          </w:tcPr>
           <w:p>
             <w:pPr>
               <w:pStyle w:val="Compact"/>
@@ -3994,7 +4217,9 @@
           </w:p>
         </w:tc>
         <w:tc>
-          <w:tcPr/>
+          <w:tcPr>
+            <w:tcW w:w="1119" w:type="dxa"/>
+          </w:tcPr>
           <w:p>
             <w:pPr>
               <w:pStyle w:val="Compact"/>
@@ -4011,7 +4236,9 @@
       </w:tr>
       <w:tr>
         <w:tc>
-          <w:tcPr/>
+          <w:tcPr>
+            <w:tcW w:w="936" w:type="dxa"/>
+          </w:tcPr>
           <w:p>
             <w:pPr>
               <w:pStyle w:val="Compact"/>
@@ -4026,7 +4253,9 @@
           </w:p>
         </w:tc>
         <w:tc>
-          <w:tcPr/>
+          <w:tcPr>
+            <w:tcW w:w="2543" w:type="dxa"/>
+          </w:tcPr>
           <w:p>
             <w:pPr>
               <w:pStyle w:val="Compact"/>
@@ -4041,7 +4270,9 @@
           </w:p>
         </w:tc>
         <w:tc>
-          <w:tcPr/>
+          <w:tcPr>
+            <w:tcW w:w="2256" w:type="dxa"/>
+          </w:tcPr>
           <w:p>
             <w:pPr>
               <w:pStyle w:val="Compact"/>
@@ -4056,7 +4287,9 @@
           </w:p>
         </w:tc>
         <w:tc>
-          <w:tcPr/>
+          <w:tcPr>
+            <w:tcW w:w="1056" w:type="dxa"/>
+          </w:tcPr>
           <w:p>
             <w:pPr>
               <w:pStyle w:val="Compact"/>
@@ -4071,7 +4304,9 @@
           </w:p>
         </w:tc>
         <w:tc>
-          <w:tcPr/>
+          <w:tcPr>
+            <w:tcW w:w="1119" w:type="dxa"/>
+          </w:tcPr>
           <w:p>
             <w:pPr>
               <w:pStyle w:val="Compact"/>
@@ -4088,7 +4323,9 @@
       </w:tr>
       <w:tr>
         <w:tc>
-          <w:tcPr/>
+          <w:tcPr>
+            <w:tcW w:w="936" w:type="dxa"/>
+          </w:tcPr>
           <w:p>
             <w:pPr>
               <w:pStyle w:val="Compact"/>
@@ -4103,7 +4340,9 @@
           </w:p>
         </w:tc>
         <w:tc>
-          <w:tcPr/>
+          <w:tcPr>
+            <w:tcW w:w="2543" w:type="dxa"/>
+          </w:tcPr>
           <w:p>
             <w:pPr>
               <w:pStyle w:val="Compact"/>
@@ -4118,7 +4357,9 @@
           </w:p>
         </w:tc>
         <w:tc>
-          <w:tcPr/>
+          <w:tcPr>
+            <w:tcW w:w="2256" w:type="dxa"/>
+          </w:tcPr>
           <w:p>
             <w:pPr>
               <w:pStyle w:val="Compact"/>
@@ -4133,7 +4374,9 @@
           </w:p>
         </w:tc>
         <w:tc>
-          <w:tcPr/>
+          <w:tcPr>
+            <w:tcW w:w="1056" w:type="dxa"/>
+          </w:tcPr>
           <w:p>
             <w:pPr>
               <w:pStyle w:val="Compact"/>
@@ -4148,7 +4391,9 @@
           </w:p>
         </w:tc>
         <w:tc>
-          <w:tcPr/>
+          <w:tcPr>
+            <w:tcW w:w="1119" w:type="dxa"/>
+          </w:tcPr>
           <w:p>
             <w:pPr>
               <w:pStyle w:val="Compact"/>
@@ -4165,7 +4410,9 @@
       </w:tr>
       <w:tr>
         <w:tc>
-          <w:tcPr/>
+          <w:tcPr>
+            <w:tcW w:w="936" w:type="dxa"/>
+          </w:tcPr>
           <w:p>
             <w:pPr>
               <w:pStyle w:val="Compact"/>
@@ -4180,7 +4427,9 @@
           </w:p>
         </w:tc>
         <w:tc>
-          <w:tcPr/>
+          <w:tcPr>
+            <w:tcW w:w="2543" w:type="dxa"/>
+          </w:tcPr>
           <w:p>
             <w:pPr>
               <w:pStyle w:val="Compact"/>
@@ -4195,7 +4444,9 @@
           </w:p>
         </w:tc>
         <w:tc>
-          <w:tcPr/>
+          <w:tcPr>
+            <w:tcW w:w="2256" w:type="dxa"/>
+          </w:tcPr>
           <w:p>
             <w:pPr>
               <w:pStyle w:val="Compact"/>
@@ -4210,7 +4461,9 @@
           </w:p>
         </w:tc>
         <w:tc>
-          <w:tcPr/>
+          <w:tcPr>
+            <w:tcW w:w="1056" w:type="dxa"/>
+          </w:tcPr>
           <w:p>
             <w:pPr>
               <w:pStyle w:val="Compact"/>
@@ -4225,7 +4478,9 @@
           </w:p>
         </w:tc>
         <w:tc>
-          <w:tcPr/>
+          <w:tcPr>
+            <w:tcW w:w="1119" w:type="dxa"/>
+          </w:tcPr>
           <w:p>
             <w:pPr>
               <w:pStyle w:val="Compact"/>
@@ -4242,7 +4497,9 @@
       </w:tr>
       <w:tr>
         <w:tc>
-          <w:tcPr/>
+          <w:tcPr>
+            <w:tcW w:w="936" w:type="dxa"/>
+          </w:tcPr>
           <w:p>
             <w:pPr>
               <w:pStyle w:val="Compact"/>
@@ -4257,7 +4514,9 @@
           </w:p>
         </w:tc>
         <w:tc>
-          <w:tcPr/>
+          <w:tcPr>
+            <w:tcW w:w="2543" w:type="dxa"/>
+          </w:tcPr>
           <w:p>
             <w:pPr>
               <w:pStyle w:val="Compact"/>
@@ -4272,7 +4531,9 @@
           </w:p>
         </w:tc>
         <w:tc>
-          <w:tcPr/>
+          <w:tcPr>
+            <w:tcW w:w="2256" w:type="dxa"/>
+          </w:tcPr>
           <w:p>
             <w:pPr>
               <w:pStyle w:val="Compact"/>
@@ -4287,7 +4548,9 @@
           </w:p>
         </w:tc>
         <w:tc>
-          <w:tcPr/>
+          <w:tcPr>
+            <w:tcW w:w="1056" w:type="dxa"/>
+          </w:tcPr>
           <w:p>
             <w:pPr>
               <w:pStyle w:val="Compact"/>
@@ -4302,7 +4565,9 @@
           </w:p>
         </w:tc>
         <w:tc>
-          <w:tcPr/>
+          <w:tcPr>
+            <w:tcW w:w="1119" w:type="dxa"/>
+          </w:tcPr>
           <w:p>
             <w:pPr>
               <w:pStyle w:val="Compact"/>
@@ -4319,7 +4584,9 @@
       </w:tr>
       <w:tr>
         <w:tc>
-          <w:tcPr/>
+          <w:tcPr>
+            <w:tcW w:w="936" w:type="dxa"/>
+          </w:tcPr>
           <w:p>
             <w:pPr>
               <w:pStyle w:val="Compact"/>
@@ -4334,7 +4601,9 @@
           </w:p>
         </w:tc>
         <w:tc>
-          <w:tcPr/>
+          <w:tcPr>
+            <w:tcW w:w="2543" w:type="dxa"/>
+          </w:tcPr>
           <w:p>
             <w:pPr>
               <w:pStyle w:val="Compact"/>
@@ -4349,7 +4618,9 @@
           </w:p>
         </w:tc>
         <w:tc>
-          <w:tcPr/>
+          <w:tcPr>
+            <w:tcW w:w="2256" w:type="dxa"/>
+          </w:tcPr>
           <w:p>
             <w:pPr>
               <w:pStyle w:val="Compact"/>
@@ -4364,7 +4635,9 @@
           </w:p>
         </w:tc>
         <w:tc>
-          <w:tcPr/>
+          <w:tcPr>
+            <w:tcW w:w="1056" w:type="dxa"/>
+          </w:tcPr>
           <w:p>
             <w:pPr>
               <w:pStyle w:val="Compact"/>
@@ -4379,7 +4652,9 @@
           </w:p>
         </w:tc>
         <w:tc>
-          <w:tcPr/>
+          <w:tcPr>
+            <w:tcW w:w="1119" w:type="dxa"/>
+          </w:tcPr>
           <w:p>
             <w:pPr>
               <w:pStyle w:val="Compact"/>
@@ -4396,7 +4671,9 @@
       </w:tr>
       <w:tr>
         <w:tc>
-          <w:tcPr/>
+          <w:tcPr>
+            <w:tcW w:w="936" w:type="dxa"/>
+          </w:tcPr>
           <w:p>
             <w:pPr>
               <w:pStyle w:val="Compact"/>
@@ -4411,7 +4688,9 @@
           </w:p>
         </w:tc>
         <w:tc>
-          <w:tcPr/>
+          <w:tcPr>
+            <w:tcW w:w="2543" w:type="dxa"/>
+          </w:tcPr>
           <w:p>
             <w:pPr>
               <w:pStyle w:val="Compact"/>
@@ -4426,7 +4705,9 @@
           </w:p>
         </w:tc>
         <w:tc>
-          <w:tcPr/>
+          <w:tcPr>
+            <w:tcW w:w="2256" w:type="dxa"/>
+          </w:tcPr>
           <w:p>
             <w:pPr>
               <w:pStyle w:val="Compact"/>
@@ -4441,7 +4722,9 @@
           </w:p>
         </w:tc>
         <w:tc>
-          <w:tcPr/>
+          <w:tcPr>
+            <w:tcW w:w="1056" w:type="dxa"/>
+          </w:tcPr>
           <w:p>
             <w:pPr>
               <w:pStyle w:val="Compact"/>
@@ -4456,7 +4739,9 @@
           </w:p>
         </w:tc>
         <w:tc>
-          <w:tcPr/>
+          <w:tcPr>
+            <w:tcW w:w="1119" w:type="dxa"/>
+          </w:tcPr>
           <w:p>
             <w:pPr>
               <w:pStyle w:val="Compact"/>
@@ -4512,8 +4797,8 @@
         </w:tblBorders>
       </w:tblPr>
       <w:tblGrid>
-        <w:gridCol w:w="3960"/>
-        <w:gridCol w:w="3960"/>
+        <w:gridCol w:w="2927"/>
+        <w:gridCol w:w="4990"/>
       </w:tblGrid>
       <w:tr>
         <w:trPr>
@@ -4521,6 +4806,7 @@
         </w:trPr>
         <w:tc>
           <w:tcPr>
+            <w:tcW w:w="2927" w:type="dxa"/>
             <w:shd w:val="clear" w:color="auto" w:fill="D9E2F3"/>
           </w:tcPr>
           <w:p>
@@ -4539,6 +4825,7 @@
         </w:tc>
         <w:tc>
           <w:tcPr>
+            <w:tcW w:w="4990" w:type="dxa"/>
             <w:shd w:val="clear" w:color="auto" w:fill="D9E2F3"/>
           </w:tcPr>
           <w:p>
@@ -4558,7 +4845,9 @@
       </w:tr>
       <w:tr>
         <w:tc>
-          <w:tcPr/>
+          <w:tcPr>
+            <w:tcW w:w="2927" w:type="dxa"/>
+          </w:tcPr>
           <w:p>
             <w:pPr>
               <w:pStyle w:val="Compact"/>
@@ -4573,7 +4862,9 @@
           </w:p>
         </w:tc>
         <w:tc>
-          <w:tcPr/>
+          <w:tcPr>
+            <w:tcW w:w="4990" w:type="dxa"/>
+          </w:tcPr>
           <w:p>
             <w:pPr>
               <w:pStyle w:val="Compact"/>
@@ -4590,7 +4881,9 @@
       </w:tr>
       <w:tr>
         <w:tc>
-          <w:tcPr/>
+          <w:tcPr>
+            <w:tcW w:w="2927" w:type="dxa"/>
+          </w:tcPr>
           <w:p>
             <w:pPr>
               <w:pStyle w:val="Compact"/>
@@ -4605,7 +4898,9 @@
           </w:p>
         </w:tc>
         <w:tc>
-          <w:tcPr/>
+          <w:tcPr>
+            <w:tcW w:w="4990" w:type="dxa"/>
+          </w:tcPr>
           <w:p>
             <w:pPr>
               <w:pStyle w:val="Compact"/>
@@ -4622,7 +4917,9 @@
       </w:tr>
       <w:tr>
         <w:tc>
-          <w:tcPr/>
+          <w:tcPr>
+            <w:tcW w:w="2927" w:type="dxa"/>
+          </w:tcPr>
           <w:p>
             <w:pPr>
               <w:pStyle w:val="Compact"/>
@@ -4637,7 +4934,9 @@
           </w:p>
         </w:tc>
         <w:tc>
-          <w:tcPr/>
+          <w:tcPr>
+            <w:tcW w:w="4990" w:type="dxa"/>
+          </w:tcPr>
           <w:p>
             <w:pPr>
               <w:pStyle w:val="Compact"/>
@@ -4654,7 +4953,9 @@
       </w:tr>
       <w:tr>
         <w:tc>
-          <w:tcPr/>
+          <w:tcPr>
+            <w:tcW w:w="2927" w:type="dxa"/>
+          </w:tcPr>
           <w:p>
             <w:pPr>
               <w:pStyle w:val="Compact"/>
@@ -4669,7 +4970,9 @@
           </w:p>
         </w:tc>
         <w:tc>
-          <w:tcPr/>
+          <w:tcPr>
+            <w:tcW w:w="4990" w:type="dxa"/>
+          </w:tcPr>
           <w:p>
             <w:pPr>
               <w:pStyle w:val="Compact"/>
@@ -4686,7 +4989,9 @@
       </w:tr>
       <w:tr>
         <w:tc>
-          <w:tcPr/>
+          <w:tcPr>
+            <w:tcW w:w="2927" w:type="dxa"/>
+          </w:tcPr>
           <w:p>
             <w:pPr>
               <w:pStyle w:val="Compact"/>
@@ -4701,7 +5006,9 @@
           </w:p>
         </w:tc>
         <w:tc>
-          <w:tcPr/>
+          <w:tcPr>
+            <w:tcW w:w="4990" w:type="dxa"/>
+          </w:tcPr>
           <w:p>
             <w:pPr>
               <w:pStyle w:val="Compact"/>
@@ -4718,7 +5025,9 @@
       </w:tr>
       <w:tr>
         <w:tc>
-          <w:tcPr/>
+          <w:tcPr>
+            <w:tcW w:w="2927" w:type="dxa"/>
+          </w:tcPr>
           <w:p>
             <w:pPr>
               <w:pStyle w:val="Compact"/>
@@ -4733,7 +5042,9 @@
           </w:p>
         </w:tc>
         <w:tc>
-          <w:tcPr/>
+          <w:tcPr>
+            <w:tcW w:w="4990" w:type="dxa"/>
+          </w:tcPr>
           <w:p>
             <w:pPr>
               <w:pStyle w:val="Compact"/>
@@ -4750,7 +5061,9 @@
       </w:tr>
       <w:tr>
         <w:tc>
-          <w:tcPr/>
+          <w:tcPr>
+            <w:tcW w:w="2927" w:type="dxa"/>
+          </w:tcPr>
           <w:p>
             <w:pPr>
               <w:pStyle w:val="Compact"/>
@@ -4765,7 +5078,9 @@
           </w:p>
         </w:tc>
         <w:tc>
-          <w:tcPr/>
+          <w:tcPr>
+            <w:tcW w:w="4990" w:type="dxa"/>
+          </w:tcPr>
           <w:p>
             <w:pPr>
               <w:pStyle w:val="Compact"/>

</xml_diff>